<commit_message>
correcting normalization steps and restructuring the documentation
</commit_message>
<xml_diff>
--- a/docs/database_design.docx
+++ b/docs/database_design.docx
@@ -1025,16 +1025,7 @@
         </w:rPr>
       </w:pPr>
     </w:p>
-    <w:p>
-      <w:pPr>
-        <w:rPr>
-          <w:b/>
-          <w:bCs/>
-          <w:sz w:val="36"/>
-          <w:szCs w:val="36"/>
-        </w:rPr>
-      </w:pPr>
-    </w:p>
+    <w:p/>
     <w:p>
       <w:pPr>
         <w:rPr>
@@ -1052,694 +1043,17 @@
           <w:szCs w:val="36"/>
         </w:rPr>
         <w:lastRenderedPageBreak/>
-        <w:t>Section 2: Business Rules</w:t>
-      </w:r>
-    </w:p>
-    <w:p>
-      <w:pPr>
-        <w:rPr>
-          <w:b/>
-          <w:bCs/>
-        </w:rPr>
-      </w:pPr>
-      <w:r>
-        <w:rPr>
-          <w:b/>
-          <w:bCs/>
-        </w:rPr>
-        <w:t>2.1 User Related Rules</w:t>
-      </w:r>
-    </w:p>
-    <w:p>
-      <w:pPr>
-        <w:numPr>
-          <w:ilvl w:val="0"/>
-          <w:numId w:val="12"/>
-        </w:numPr>
-      </w:pPr>
-      <w:r>
-        <w:t>A user must register with valid email and password to make bookings.</w:t>
-      </w:r>
-    </w:p>
-    <w:p>
-      <w:pPr>
-        <w:numPr>
-          <w:ilvl w:val="0"/>
-          <w:numId w:val="12"/>
-        </w:numPr>
-      </w:pPr>
-      <w:r>
-        <w:t>A user can have only one active account per email address.</w:t>
-      </w:r>
-    </w:p>
-    <w:p>
-      <w:pPr>
-        <w:numPr>
-          <w:ilvl w:val="0"/>
-          <w:numId w:val="12"/>
-        </w:numPr>
-      </w:pPr>
-      <w:r>
-        <w:t xml:space="preserve">A user can view movies without logging </w:t>
-      </w:r>
-      <w:proofErr w:type="gramStart"/>
-      <w:r>
-        <w:t>in, but</w:t>
-      </w:r>
-      <w:proofErr w:type="gramEnd"/>
-      <w:r>
-        <w:t xml:space="preserve"> must log in to book tickets.</w:t>
-      </w:r>
-    </w:p>
-    <w:p>
-      <w:pPr>
-        <w:numPr>
-          <w:ilvl w:val="0"/>
-          <w:numId w:val="12"/>
-        </w:numPr>
-      </w:pPr>
-      <w:r>
-        <w:t>A user can view their own booking history only.</w:t>
-      </w:r>
-    </w:p>
-    <w:p>
-      <w:pPr>
-        <w:numPr>
-          <w:ilvl w:val="0"/>
-          <w:numId w:val="12"/>
-        </w:numPr>
-      </w:pPr>
-      <w:r>
-        <w:t>An admin has special privileges to manage movies, theaters, and shows.</w:t>
-      </w:r>
-    </w:p>
-    <w:p>
-      <w:pPr>
-        <w:numPr>
-          <w:ilvl w:val="0"/>
-          <w:numId w:val="12"/>
-        </w:numPr>
-      </w:pPr>
-      <w:r>
-        <w:t>A user cannot book tickets for shows that have already started or passed.</w:t>
-      </w:r>
-    </w:p>
-    <w:p/>
-    <w:p>
-      <w:pPr>
-        <w:rPr>
-          <w:b/>
-          <w:bCs/>
-        </w:rPr>
-      </w:pPr>
-      <w:r>
-        <w:rPr>
-          <w:b/>
-          <w:bCs/>
-        </w:rPr>
-        <w:t>2.2 Movie Related Rules</w:t>
-      </w:r>
-    </w:p>
-    <w:p>
-      <w:pPr>
-        <w:numPr>
-          <w:ilvl w:val="0"/>
-          <w:numId w:val="13"/>
-        </w:numPr>
-      </w:pPr>
-      <w:r>
-        <w:t>A movie must have a unique title, release date, duration, genre, rating, and description.</w:t>
-      </w:r>
-    </w:p>
-    <w:p>
-      <w:pPr>
-        <w:numPr>
-          <w:ilvl w:val="0"/>
-          <w:numId w:val="13"/>
-        </w:numPr>
-      </w:pPr>
-      <w:r>
-        <w:t>A movie can be screened in multiple theaters across multiple showtimes.</w:t>
-      </w:r>
-    </w:p>
-    <w:p>
-      <w:pPr>
-        <w:numPr>
-          <w:ilvl w:val="0"/>
-          <w:numId w:val="13"/>
-        </w:numPr>
-      </w:pPr>
-      <w:r>
-        <w:t>A movie can have multiple shows, but not at the exact same time in the same hall.</w:t>
-      </w:r>
-    </w:p>
-    <w:p>
-      <w:pPr>
-        <w:numPr>
-          <w:ilvl w:val="0"/>
-          <w:numId w:val="13"/>
-        </w:numPr>
-      </w:pPr>
-      <w:r>
-        <w:t>A movie's poster image is optional but recommended for display.</w:t>
-      </w:r>
-    </w:p>
-    <w:p/>
-    <w:p>
-      <w:pPr>
-        <w:rPr>
-          <w:b/>
-          <w:bCs/>
-        </w:rPr>
-      </w:pPr>
-      <w:r>
-        <w:rPr>
-          <w:b/>
-          <w:bCs/>
-        </w:rPr>
-        <w:t>2.3 Theater Related Rules</w:t>
-      </w:r>
-    </w:p>
-    <w:p>
-      <w:pPr>
-        <w:numPr>
-          <w:ilvl w:val="0"/>
-          <w:numId w:val="14"/>
-        </w:numPr>
-      </w:pPr>
-      <w:r>
-        <w:t>A theater must have a unique name and location.</w:t>
-      </w:r>
-    </w:p>
-    <w:p>
-      <w:pPr>
-        <w:numPr>
-          <w:ilvl w:val="0"/>
-          <w:numId w:val="14"/>
-        </w:numPr>
-      </w:pPr>
-      <w:r>
-        <w:t>A theater can have one or more halls (screens).</w:t>
-      </w:r>
-    </w:p>
-    <w:p>
-      <w:pPr>
-        <w:numPr>
-          <w:ilvl w:val="0"/>
-          <w:numId w:val="14"/>
-        </w:numPr>
-      </w:pPr>
-      <w:r>
-        <w:t>Each hall in a theater has a fixed seat layout.</w:t>
-      </w:r>
-    </w:p>
-    <w:p>
-      <w:pPr>
-        <w:numPr>
-          <w:ilvl w:val="0"/>
-          <w:numId w:val="14"/>
-        </w:numPr>
-      </w:pPr>
-      <w:r>
-        <w:t>A theater can screen multiple movies in different halls at the same time.</w:t>
-      </w:r>
-    </w:p>
-    <w:p>
-      <w:pPr>
-        <w:numPr>
-          <w:ilvl w:val="0"/>
-          <w:numId w:val="14"/>
-        </w:numPr>
-      </w:pPr>
-      <w:r>
-        <w:t>A theater can have multiple showtimes for the same movie in different halls.</w:t>
-      </w:r>
-    </w:p>
-    <w:p/>
-    <w:p>
-      <w:pPr>
-        <w:rPr>
-          <w:b/>
-          <w:bCs/>
-        </w:rPr>
-      </w:pPr>
-      <w:r>
-        <w:rPr>
-          <w:b/>
-          <w:bCs/>
-        </w:rPr>
-        <w:t>2.4 Show Related Rules</w:t>
-      </w:r>
-    </w:p>
-    <w:p>
-      <w:pPr>
-        <w:numPr>
-          <w:ilvl w:val="0"/>
-          <w:numId w:val="15"/>
-        </w:numPr>
-      </w:pPr>
-      <w:r>
-        <w:t>A show is defined by a specific movie, theater, hall, date, time, and ticket price.</w:t>
-      </w:r>
-    </w:p>
-    <w:p>
-      <w:pPr>
-        <w:numPr>
-          <w:ilvl w:val="0"/>
-          <w:numId w:val="15"/>
-        </w:numPr>
-      </w:pPr>
-      <w:r>
-        <w:t>A show cannot be created for a movie that doesn't exist in the system.</w:t>
-      </w:r>
-    </w:p>
-    <w:p>
-      <w:pPr>
-        <w:numPr>
-          <w:ilvl w:val="0"/>
-          <w:numId w:val="15"/>
-        </w:numPr>
-      </w:pPr>
-      <w:r>
-        <w:lastRenderedPageBreak/>
-        <w:t>A show cannot be created for a theater that doesn't exist in the system.</w:t>
-      </w:r>
-    </w:p>
-    <w:p>
-      <w:pPr>
-        <w:numPr>
-          <w:ilvl w:val="0"/>
-          <w:numId w:val="15"/>
-        </w:numPr>
-      </w:pPr>
-      <w:r>
-        <w:t>A show must have a unique combination of theater, hall, date, and time (no double-booking of same hall).</w:t>
-      </w:r>
-    </w:p>
-    <w:p>
-      <w:pPr>
-        <w:numPr>
-          <w:ilvl w:val="0"/>
-          <w:numId w:val="15"/>
-        </w:numPr>
-      </w:pPr>
-      <w:r>
-        <w:t xml:space="preserve">Ticket </w:t>
-      </w:r>
-      <w:proofErr w:type="gramStart"/>
-      <w:r>
-        <w:t>price</w:t>
-      </w:r>
-      <w:proofErr w:type="gramEnd"/>
-      <w:r>
-        <w:t xml:space="preserve"> can vary per show (e.g., matinee vs evening pricing).</w:t>
-      </w:r>
-    </w:p>
-    <w:p/>
-    <w:p>
-      <w:pPr>
-        <w:rPr>
-          <w:b/>
-          <w:bCs/>
-        </w:rPr>
-      </w:pPr>
-      <w:r>
-        <w:rPr>
-          <w:b/>
-          <w:bCs/>
-        </w:rPr>
-        <w:t>2.5 Seat Related Rules</w:t>
-      </w:r>
-    </w:p>
-    <w:p>
-      <w:pPr>
-        <w:numPr>
-          <w:ilvl w:val="0"/>
-          <w:numId w:val="16"/>
-        </w:numPr>
-      </w:pPr>
-      <w:r>
-        <w:t>Each seat in a hall has a unique identifier (e.g., A1, A2, B1, B2).</w:t>
-      </w:r>
-    </w:p>
-    <w:p>
-      <w:pPr>
-        <w:numPr>
-          <w:ilvl w:val="0"/>
-          <w:numId w:val="16"/>
-        </w:numPr>
-      </w:pPr>
-      <w:r>
-        <w:t>A seat can be in one of three states: Available, Booked, or Selected (temporary).</w:t>
-      </w:r>
-    </w:p>
-    <w:p>
-      <w:pPr>
-        <w:numPr>
-          <w:ilvl w:val="0"/>
-          <w:numId w:val="16"/>
-        </w:numPr>
-      </w:pPr>
-      <w:r>
-        <w:t>A seat can only be booked for one show at a given time.</w:t>
-      </w:r>
-    </w:p>
-    <w:p>
-      <w:pPr>
-        <w:numPr>
-          <w:ilvl w:val="0"/>
-          <w:numId w:val="16"/>
-        </w:numPr>
-      </w:pPr>
-      <w:r>
-        <w:t>Selected seats are held temporarily during booking process (time-limited hold).</w:t>
-      </w:r>
-    </w:p>
-    <w:p>
-      <w:pPr>
-        <w:numPr>
-          <w:ilvl w:val="0"/>
-          <w:numId w:val="16"/>
-        </w:numPr>
-      </w:pPr>
-      <w:r>
-        <w:t>Once a booking is confirmed, selected seats become permanently booked.</w:t>
-      </w:r>
-    </w:p>
-    <w:p/>
-    <w:p>
-      <w:pPr>
-        <w:rPr>
-          <w:b/>
-          <w:bCs/>
-        </w:rPr>
-      </w:pPr>
-      <w:r>
-        <w:rPr>
-          <w:b/>
-          <w:bCs/>
-        </w:rPr>
-        <w:t>2.6 Booking Related Rules</w:t>
-      </w:r>
-    </w:p>
-    <w:p>
-      <w:pPr>
-        <w:numPr>
-          <w:ilvl w:val="0"/>
-          <w:numId w:val="17"/>
-        </w:numPr>
-      </w:pPr>
-      <w:r>
-        <w:t>A booking must be associated with exactly one user.</w:t>
-      </w:r>
-    </w:p>
-    <w:p>
-      <w:pPr>
-        <w:numPr>
-          <w:ilvl w:val="0"/>
-          <w:numId w:val="17"/>
-        </w:numPr>
-      </w:pPr>
-      <w:r>
-        <w:t>A booking must be associated with exactly one show.</w:t>
-      </w:r>
-    </w:p>
-    <w:p>
-      <w:pPr>
-        <w:numPr>
-          <w:ilvl w:val="0"/>
-          <w:numId w:val="17"/>
-        </w:numPr>
-      </w:pPr>
-      <w:r>
-        <w:t>A booking can include one or more seats.</w:t>
-      </w:r>
-    </w:p>
-    <w:p>
-      <w:pPr>
-        <w:numPr>
-          <w:ilvl w:val="0"/>
-          <w:numId w:val="17"/>
-        </w:numPr>
-      </w:pPr>
-      <w:r>
-        <w:t>A booking generates a unique Booking ID.</w:t>
-      </w:r>
-    </w:p>
-    <w:p>
-      <w:pPr>
-        <w:numPr>
-          <w:ilvl w:val="0"/>
-          <w:numId w:val="17"/>
-        </w:numPr>
-      </w:pPr>
-      <w:r>
-        <w:t>Total price is calculated as (number of seats × ticket price).</w:t>
-      </w:r>
-    </w:p>
-    <w:p>
-      <w:pPr>
-        <w:numPr>
-          <w:ilvl w:val="0"/>
-          <w:numId w:val="17"/>
-        </w:numPr>
-      </w:pPr>
-      <w:r>
-        <w:t>A booking cannot be modified after payment is completed (cancellation may be allowed separately).</w:t>
-      </w:r>
-    </w:p>
-    <w:p>
-      <w:pPr>
-        <w:numPr>
-          <w:ilvl w:val="0"/>
-          <w:numId w:val="17"/>
-        </w:numPr>
-      </w:pPr>
-      <w:r>
-        <w:t>A booking must have a timestamp of when it was created.</w:t>
-      </w:r>
-    </w:p>
-    <w:p/>
-    <w:p/>
-    <w:p/>
-    <w:p/>
-    <w:p/>
-    <w:p/>
-    <w:p>
-      <w:pPr>
-        <w:rPr>
-          <w:b/>
-          <w:bCs/>
-        </w:rPr>
-      </w:pPr>
-      <w:r>
-        <w:rPr>
-          <w:b/>
-          <w:bCs/>
-        </w:rPr>
-        <w:lastRenderedPageBreak/>
-        <w:t>2.7 Payment Related Rules</w:t>
-      </w:r>
-    </w:p>
-    <w:p>
-      <w:pPr>
-        <w:numPr>
-          <w:ilvl w:val="0"/>
-          <w:numId w:val="18"/>
-        </w:numPr>
-      </w:pPr>
-      <w:r>
-        <w:t xml:space="preserve">A booking must have </w:t>
-      </w:r>
-      <w:proofErr w:type="gramStart"/>
-      <w:r>
-        <w:t>a payment</w:t>
-      </w:r>
-      <w:proofErr w:type="gramEnd"/>
-      <w:r>
-        <w:t xml:space="preserve"> status (Pending, Completed, Failed, Refunded).</w:t>
-      </w:r>
-    </w:p>
-    <w:p>
-      <w:pPr>
-        <w:numPr>
-          <w:ilvl w:val="0"/>
-          <w:numId w:val="18"/>
-        </w:numPr>
-      </w:pPr>
-      <w:r>
-        <w:t>Payment can be made through various methods (credit card, debit card, mobile payment, cash).</w:t>
-      </w:r>
-    </w:p>
-    <w:p>
-      <w:pPr>
-        <w:numPr>
-          <w:ilvl w:val="0"/>
-          <w:numId w:val="18"/>
-        </w:numPr>
-      </w:pPr>
-      <w:r>
-        <w:t>A ticket is generated only after payment is successfully completed.</w:t>
-      </w:r>
-    </w:p>
-    <w:p>
-      <w:pPr>
-        <w:numPr>
-          <w:ilvl w:val="0"/>
-          <w:numId w:val="18"/>
-        </w:numPr>
-      </w:pPr>
-      <w:r>
-        <w:t>Payment amount must match the total booking price.</w:t>
-      </w:r>
-    </w:p>
-    <w:p/>
-    <w:p>
-      <w:pPr>
-        <w:rPr>
-          <w:b/>
-          <w:bCs/>
-        </w:rPr>
-      </w:pPr>
-      <w:r>
-        <w:rPr>
-          <w:b/>
-          <w:bCs/>
-        </w:rPr>
-        <w:t>2.8 Ticket Related Rules</w:t>
-      </w:r>
-    </w:p>
-    <w:p>
-      <w:pPr>
-        <w:numPr>
-          <w:ilvl w:val="0"/>
-          <w:numId w:val="19"/>
-        </w:numPr>
-      </w:pPr>
-      <w:r>
-        <w:t>A ticket is generated for each confirmed booking.</w:t>
-      </w:r>
-    </w:p>
-    <w:p>
-      <w:pPr>
-        <w:numPr>
-          <w:ilvl w:val="0"/>
-          <w:numId w:val="19"/>
-        </w:numPr>
-      </w:pPr>
-      <w:r>
-        <w:t>A ticket contains: Ticket ID, Booking ID, Movie name, Theater name, Show time, Seat numbers, Total price.</w:t>
-      </w:r>
-    </w:p>
-    <w:p>
-      <w:pPr>
-        <w:numPr>
-          <w:ilvl w:val="0"/>
-          <w:numId w:val="19"/>
-        </w:numPr>
-      </w:pPr>
-      <w:r>
-        <w:t>A ticket is unique and cannot be duplicated.</w:t>
-      </w:r>
-    </w:p>
-    <w:p>
-      <w:pPr>
-        <w:numPr>
-          <w:ilvl w:val="0"/>
-          <w:numId w:val="19"/>
-        </w:numPr>
-      </w:pPr>
-      <w:r>
-        <w:t>A ticket can be viewed by the user in their booking history.</w:t>
-      </w:r>
-    </w:p>
-    <w:p/>
-    <w:p>
-      <w:pPr>
-        <w:rPr>
-          <w:b/>
-          <w:bCs/>
-        </w:rPr>
-      </w:pPr>
-      <w:r>
-        <w:rPr>
-          <w:b/>
-          <w:bCs/>
-        </w:rPr>
-        <w:t>2.9 Admin Related Rules</w:t>
-      </w:r>
-    </w:p>
-    <w:p>
-      <w:pPr>
-        <w:numPr>
-          <w:ilvl w:val="0"/>
-          <w:numId w:val="20"/>
-        </w:numPr>
-      </w:pPr>
-      <w:r>
-        <w:t>An admin can add, update, or delete movies.</w:t>
-      </w:r>
-    </w:p>
-    <w:p>
-      <w:pPr>
-        <w:numPr>
-          <w:ilvl w:val="0"/>
-          <w:numId w:val="20"/>
-        </w:numPr>
-      </w:pPr>
-      <w:r>
-        <w:t>An admin can add, update, or delete theaters.</w:t>
-      </w:r>
-    </w:p>
-    <w:p>
-      <w:pPr>
-        <w:numPr>
-          <w:ilvl w:val="0"/>
-          <w:numId w:val="20"/>
-        </w:numPr>
-      </w:pPr>
-      <w:r>
-        <w:t>An admin can create, modify, or cancel shows.</w:t>
-      </w:r>
-    </w:p>
-    <w:p>
-      <w:pPr>
-        <w:numPr>
-          <w:ilvl w:val="0"/>
-          <w:numId w:val="20"/>
-        </w:numPr>
-      </w:pPr>
-      <w:r>
-        <w:t>An admin can view all bookings across all users.</w:t>
-      </w:r>
-    </w:p>
-    <w:p>
-      <w:pPr>
-        <w:numPr>
-          <w:ilvl w:val="0"/>
-          <w:numId w:val="20"/>
-        </w:numPr>
-      </w:pPr>
-      <w:r>
-        <w:t>An admin cannot modify or delete confirmed bookings (for data integrity).</w:t>
-      </w:r>
-    </w:p>
-    <w:p/>
-    <w:p/>
-    <w:p/>
-    <w:p/>
-    <w:p/>
-    <w:p/>
-    <w:p/>
-    <w:p>
-      <w:pPr>
+        <w:t xml:space="preserve">Section </w:t>
+      </w:r>
+      <w:r>
         <w:rPr>
           <w:b/>
           <w:bCs/>
           <w:sz w:val="36"/>
           <w:szCs w:val="36"/>
         </w:rPr>
-      </w:pPr>
+        <w:t>2</w:t>
+      </w:r>
       <w:r>
         <w:rPr>
           <w:b/>
@@ -1747,8 +1061,7 @@
           <w:sz w:val="36"/>
           <w:szCs w:val="36"/>
         </w:rPr>
-        <w:lastRenderedPageBreak/>
-        <w:t>Section 3: Initial Entity Relationship Model</w:t>
+        <w:t>: Initial Entity Relationship Model</w:t>
       </w:r>
     </w:p>
     <w:p>
@@ -1763,7 +1076,14 @@
           <w:b/>
           <w:bCs/>
         </w:rPr>
-        <w:t>3.1 Identification of Entities and Attributes</w:t>
+        <w:t>2</w:t>
+      </w:r>
+      <w:r>
+        <w:rPr>
+          <w:b/>
+          <w:bCs/>
+        </w:rPr>
+        <w:t>.1 Identification of Entities and Attributes</w:t>
       </w:r>
     </w:p>
     <w:p>
@@ -2480,11 +1800,7 @@
           <w:tcPr>
             <w:tcW w:w="2338" w:type="dxa"/>
           </w:tcPr>
-          <w:p>
-            <w:r>
-              <w:t>(e.g., "A1, A2, A3")</w:t>
-            </w:r>
-          </w:p>
+          <w:p/>
         </w:tc>
       </w:tr>
       <w:tr>
@@ -2929,11 +2245,7 @@
           <w:tcPr>
             <w:tcW w:w="2338" w:type="dxa"/>
           </w:tcPr>
-          <w:p>
-            <w:r>
-              <w:t>(in minutes)</w:t>
-            </w:r>
-          </w:p>
+          <w:p/>
         </w:tc>
       </w:tr>
       <w:tr>
@@ -3009,11 +2321,7 @@
           <w:tcPr>
             <w:tcW w:w="2338" w:type="dxa"/>
           </w:tcPr>
-          <w:p>
-            <w:r>
-              <w:t>(e.g., 8.5)</w:t>
-            </w:r>
-          </w:p>
+          <w:p/>
         </w:tc>
       </w:tr>
       <w:tr>
@@ -4273,11 +3581,7 @@
           <w:tcPr>
             <w:tcW w:w="3157" w:type="dxa"/>
           </w:tcPr>
-          <w:p>
-            <w:r>
-              <w:t>(e.g., "A1")</w:t>
-            </w:r>
-          </w:p>
+          <w:p/>
         </w:tc>
       </w:tr>
       <w:tr>
@@ -4317,11 +3621,7 @@
           <w:tcPr>
             <w:tcW w:w="3157" w:type="dxa"/>
           </w:tcPr>
-          <w:p>
-            <w:r>
-              <w:t>(Available/Booked/Selected)</w:t>
-            </w:r>
-          </w:p>
+          <w:p/>
         </w:tc>
       </w:tr>
       <w:tr>
@@ -4666,7 +3966,25 @@
           <w:szCs w:val="36"/>
         </w:rPr>
         <w:lastRenderedPageBreak/>
-        <w:t>Section 4: Normalization</w:t>
+        <w:t xml:space="preserve">Section </w:t>
+      </w:r>
+      <w:r>
+        <w:rPr>
+          <w:b/>
+          <w:bCs/>
+          <w:sz w:val="36"/>
+          <w:szCs w:val="36"/>
+        </w:rPr>
+        <w:t>3</w:t>
+      </w:r>
+      <w:r>
+        <w:rPr>
+          <w:b/>
+          <w:bCs/>
+          <w:sz w:val="36"/>
+          <w:szCs w:val="36"/>
+        </w:rPr>
+        <w:t>: Normalization</w:t>
       </w:r>
     </w:p>
     <w:p>
@@ -4688,11 +4006,9 @@
       <w:r>
         <w:t>UNF_MOVIE_</w:t>
       </w:r>
-      <w:proofErr w:type="gramStart"/>
-      <w:r>
-        <w:t>BOOKING(</w:t>
-      </w:r>
-      <w:proofErr w:type="gramEnd"/>
+      <w:r>
+        <w:t>BOOKING (</w:t>
+      </w:r>
     </w:p>
     <w:p>
       <w:r>
@@ -5537,10 +4853,7 @@
           </w:tcPr>
           <w:p>
             <w:r>
-              <w:t>VARCHAR (</w:t>
-            </w:r>
-            <w:r>
-              <w:t>10)</w:t>
+              <w:t>VARCHAR (10)</w:t>
             </w:r>
           </w:p>
         </w:tc>
@@ -6171,10 +5484,7 @@
           </w:tcPr>
           <w:p>
             <w:r>
-              <w:t>TEXT</w:t>
-            </w:r>
-            <w:r>
-              <w:t xml:space="preserve"> </w:t>
+              <w:t xml:space="preserve">TEXT </w:t>
             </w:r>
           </w:p>
         </w:tc>
@@ -7252,7 +6562,7 @@
     </w:p>
     <w:p>
       <w:r>
-        <w:t>Result: Stays as is (trivially in 2NF)</w:t>
+        <w:t xml:space="preserve">Result: Stays as is </w:t>
       </w:r>
     </w:p>
     <w:p/>
@@ -7974,30 +7284,29 @@
       </w:r>
     </w:p>
     <w:p>
-      <w:pPr>
-        <w:rPr>
-          <w:b/>
-          <w:bCs/>
-        </w:rPr>
-      </w:pPr>
-      <w:r>
-        <w:rPr>
-          <w:b/>
-          <w:bCs/>
-        </w:rPr>
-        <w:t>STEP 1: Check MOVIE Table</w:t>
-      </w:r>
-    </w:p>
-    <w:p>
-      <w:r>
-        <w:rPr>
-          <w:b/>
-          <w:bCs/>
-        </w:rPr>
-        <w:t>MOVIE (2NF)</w:t>
-      </w:r>
-      <w:r>
-        <w:br/>
+      <w:r>
+        <w:t>Step 1: MOVIE Table</w:t>
+      </w:r>
+    </w:p>
+    <w:p>
+      <w:pPr>
+        <w:numPr>
+          <w:ilvl w:val="0"/>
+          <w:numId w:val="27"/>
+        </w:numPr>
+      </w:pPr>
+      <w:r>
+        <w:t>Current Form: 2NF</w:t>
+      </w:r>
+    </w:p>
+    <w:p>
+      <w:pPr>
+        <w:numPr>
+          <w:ilvl w:val="0"/>
+          <w:numId w:val="27"/>
+        </w:numPr>
+      </w:pPr>
+      <w:r>
         <w:t xml:space="preserve">Primary Key: </w:t>
       </w:r>
       <w:proofErr w:type="spellStart"/>
@@ -8005,82 +7314,457 @@
         <w:t>Movie_ID</w:t>
       </w:r>
       <w:proofErr w:type="spellEnd"/>
-      <w:r>
-        <w:br/>
-        <w:t>Check: Do any non-key attributes depend on other non-key attributes?</w:t>
-      </w:r>
-      <w:r>
-        <w:br/>
-        <w:t>transitive dependencies found</w:t>
-      </w:r>
-      <w:r>
-        <w:br/>
-        <w:t>Result: </w:t>
-      </w:r>
-      <w:r>
-        <w:rPr>
-          <w:b/>
-          <w:bCs/>
-        </w:rPr>
-        <w:t>Stays as is</w:t>
+    </w:p>
+    <w:p>
+      <w:pPr>
+        <w:numPr>
+          <w:ilvl w:val="0"/>
+          <w:numId w:val="27"/>
+        </w:numPr>
+      </w:pPr>
+      <w:r>
+        <w:t xml:space="preserve">Observation: Attributes depend directly on </w:t>
+      </w:r>
+      <w:proofErr w:type="spellStart"/>
+      <w:r>
+        <w:t>Movie_ID</w:t>
+      </w:r>
+      <w:proofErr w:type="spellEnd"/>
+      <w:r>
+        <w:t>, no transitive dependency identified</w:t>
+      </w:r>
+    </w:p>
+    <w:p>
+      <w:pPr>
+        <w:numPr>
+          <w:ilvl w:val="0"/>
+          <w:numId w:val="27"/>
+        </w:numPr>
+      </w:pPr>
+      <w:r>
+        <w:t>Result: Table remains unchanged</w:t>
+      </w:r>
+    </w:p>
+    <w:p>
+      <w:r>
+        <w:t>Step 2: THEATER_HALL Table</w:t>
+      </w:r>
+    </w:p>
+    <w:p>
+      <w:pPr>
+        <w:numPr>
+          <w:ilvl w:val="0"/>
+          <w:numId w:val="28"/>
+        </w:numPr>
+      </w:pPr>
+      <w:r>
+        <w:t>Current Form: 2NF</w:t>
+      </w:r>
+    </w:p>
+    <w:p>
+      <w:pPr>
+        <w:numPr>
+          <w:ilvl w:val="0"/>
+          <w:numId w:val="28"/>
+        </w:numPr>
+      </w:pPr>
+      <w:r>
+        <w:t xml:space="preserve">Primary Key: </w:t>
+      </w:r>
+      <w:proofErr w:type="spellStart"/>
+      <w:r>
+        <w:t>Hall_ID</w:t>
+      </w:r>
+      <w:proofErr w:type="spellEnd"/>
+    </w:p>
+    <w:p>
+      <w:pPr>
+        <w:numPr>
+          <w:ilvl w:val="0"/>
+          <w:numId w:val="28"/>
+        </w:numPr>
+      </w:pPr>
+      <w:r>
+        <w:t xml:space="preserve">Observation: Theater details (Name, Location, </w:t>
+      </w:r>
+      <w:proofErr w:type="spellStart"/>
+      <w:r>
+        <w:t>Total_Halls</w:t>
+      </w:r>
+      <w:proofErr w:type="spellEnd"/>
+      <w:r>
+        <w:t xml:space="preserve">) depend on </w:t>
+      </w:r>
+      <w:proofErr w:type="spellStart"/>
+      <w:r>
+        <w:t>Theater_ID</w:t>
+      </w:r>
+      <w:proofErr w:type="spellEnd"/>
+      <w:r>
+        <w:t xml:space="preserve"> rather than </w:t>
+      </w:r>
+      <w:proofErr w:type="spellStart"/>
+      <w:r>
+        <w:t>Hall_ID</w:t>
+      </w:r>
+      <w:proofErr w:type="spellEnd"/>
+      <w:r>
+        <w:t>, creating a transitive dependency</w:t>
+      </w:r>
+    </w:p>
+    <w:p>
+      <w:pPr>
+        <w:numPr>
+          <w:ilvl w:val="0"/>
+          <w:numId w:val="28"/>
+        </w:numPr>
+      </w:pPr>
+      <w:r>
+        <w:t>Result: Split into two tables</w:t>
+      </w:r>
+    </w:p>
+    <w:p>
+      <w:pPr>
+        <w:numPr>
+          <w:ilvl w:val="0"/>
+          <w:numId w:val="29"/>
+        </w:numPr>
+      </w:pPr>
+      <w:r>
+        <w:t>THEATER (</w:t>
+      </w:r>
+      <w:proofErr w:type="spellStart"/>
+      <w:r>
+        <w:t>Theater_ID</w:t>
+      </w:r>
+      <w:proofErr w:type="spellEnd"/>
+      <w:r>
+        <w:t xml:space="preserve">, </w:t>
+      </w:r>
+      <w:proofErr w:type="spellStart"/>
+      <w:r>
+        <w:t>Theater_Name</w:t>
+      </w:r>
+      <w:proofErr w:type="spellEnd"/>
+      <w:r>
+        <w:t xml:space="preserve">, </w:t>
+      </w:r>
+      <w:proofErr w:type="spellStart"/>
+      <w:r>
+        <w:t>Theater_Location</w:t>
+      </w:r>
+      <w:proofErr w:type="spellEnd"/>
+      <w:r>
+        <w:t xml:space="preserve">, </w:t>
+      </w:r>
+      <w:proofErr w:type="spellStart"/>
+      <w:r>
+        <w:t>Total_Halls</w:t>
+      </w:r>
+      <w:proofErr w:type="spellEnd"/>
+      <w:r>
+        <w:t>)</w:t>
+      </w:r>
+    </w:p>
+    <w:p>
+      <w:pPr>
+        <w:numPr>
+          <w:ilvl w:val="0"/>
+          <w:numId w:val="29"/>
+        </w:numPr>
+      </w:pPr>
+      <w:r>
+        <w:t>HALL (</w:t>
+      </w:r>
+      <w:proofErr w:type="spellStart"/>
+      <w:r>
+        <w:t>Hall_ID</w:t>
+      </w:r>
+      <w:proofErr w:type="spellEnd"/>
+      <w:r>
+        <w:t xml:space="preserve">, </w:t>
+      </w:r>
+      <w:proofErr w:type="spellStart"/>
+      <w:r>
+        <w:t>Theater_ID</w:t>
+      </w:r>
+      <w:proofErr w:type="spellEnd"/>
+      <w:r>
+        <w:t xml:space="preserve">, </w:t>
+      </w:r>
+      <w:proofErr w:type="spellStart"/>
+      <w:r>
+        <w:t>Hall_Number</w:t>
+      </w:r>
+      <w:proofErr w:type="spellEnd"/>
+      <w:r>
+        <w:t xml:space="preserve">, </w:t>
+      </w:r>
+      <w:proofErr w:type="spellStart"/>
+      <w:r>
+        <w:t>Hall_Capacity</w:t>
+      </w:r>
+      <w:proofErr w:type="spellEnd"/>
+      <w:r>
+        <w:t>)</w:t>
       </w:r>
     </w:p>
     <w:p/>
     <w:p>
-      <w:pPr>
-        <w:rPr>
-          <w:b/>
-          <w:bCs/>
-        </w:rPr>
-      </w:pPr>
-      <w:r>
-        <w:rPr>
-          <w:b/>
-          <w:bCs/>
-        </w:rPr>
-        <w:t>STEP 2: Check THEATER_HALL Table</w:t>
-      </w:r>
-    </w:p>
-    <w:p>
-      <w:r>
-        <w:rPr>
-          <w:b/>
-          <w:bCs/>
-        </w:rPr>
-        <w:t>THEATER_HALL (2NF)</w:t>
-      </w:r>
-      <w:r>
-        <w:br/>
+      <w:r>
+        <w:t>Step 3: SHOW Table</w:t>
+      </w:r>
+    </w:p>
+    <w:p>
+      <w:pPr>
+        <w:numPr>
+          <w:ilvl w:val="0"/>
+          <w:numId w:val="30"/>
+        </w:numPr>
+      </w:pPr>
+      <w:r>
+        <w:t>Current Form: 2NF</w:t>
+      </w:r>
+    </w:p>
+    <w:p>
+      <w:pPr>
+        <w:numPr>
+          <w:ilvl w:val="0"/>
+          <w:numId w:val="30"/>
+        </w:numPr>
+      </w:pPr>
+      <w:r>
         <w:t xml:space="preserve">Primary Key: </w:t>
       </w:r>
       <w:proofErr w:type="spellStart"/>
       <w:r>
-        <w:t>Hall_ID</w:t>
-      </w:r>
-      <w:proofErr w:type="spellEnd"/>
-      <w:r>
-        <w:br/>
-        <w:t xml:space="preserve">Check: </w:t>
-      </w:r>
-      <w:proofErr w:type="spellStart"/>
-      <w:r>
-        <w:t>Hall_ID</w:t>
-      </w:r>
-      <w:proofErr w:type="spellEnd"/>
-      <w:r>
-        <w:t xml:space="preserve"> → </w:t>
-      </w:r>
-      <w:proofErr w:type="spellStart"/>
-      <w:r>
-        <w:t>Theater_ID</w:t>
-      </w:r>
-      <w:proofErr w:type="spellEnd"/>
-      <w:r>
-        <w:t xml:space="preserve"> → </w:t>
-      </w:r>
-      <w:proofErr w:type="spellStart"/>
-      <w:r>
-        <w:t>Theater_Name</w:t>
+        <w:t>Show_ID</w:t>
+      </w:r>
+      <w:proofErr w:type="spellEnd"/>
+    </w:p>
+    <w:p>
+      <w:pPr>
+        <w:numPr>
+          <w:ilvl w:val="0"/>
+          <w:numId w:val="30"/>
+        </w:numPr>
+      </w:pPr>
+      <w:r>
+        <w:t xml:space="preserve">Observation: All attributes depend directly on </w:t>
+      </w:r>
+      <w:proofErr w:type="spellStart"/>
+      <w:r>
+        <w:t>Show_ID</w:t>
+      </w:r>
+      <w:proofErr w:type="spellEnd"/>
+      <w:r>
+        <w:t>, no transitive dependency</w:t>
+      </w:r>
+    </w:p>
+    <w:p>
+      <w:pPr>
+        <w:numPr>
+          <w:ilvl w:val="0"/>
+          <w:numId w:val="30"/>
+        </w:numPr>
+      </w:pPr>
+      <w:r>
+        <w:t>Result: Table remains unchanged</w:t>
+      </w:r>
+    </w:p>
+    <w:p>
+      <w:r>
+        <w:t>Step 4: CUSTOMER Table</w:t>
+      </w:r>
+    </w:p>
+    <w:p>
+      <w:pPr>
+        <w:numPr>
+          <w:ilvl w:val="0"/>
+          <w:numId w:val="31"/>
+        </w:numPr>
+      </w:pPr>
+      <w:r>
+        <w:t>Current Form: 2NF</w:t>
+      </w:r>
+    </w:p>
+    <w:p>
+      <w:pPr>
+        <w:numPr>
+          <w:ilvl w:val="0"/>
+          <w:numId w:val="31"/>
+        </w:numPr>
+      </w:pPr>
+      <w:r>
+        <w:lastRenderedPageBreak/>
+        <w:t xml:space="preserve">Primary Key: </w:t>
+      </w:r>
+      <w:proofErr w:type="spellStart"/>
+      <w:r>
+        <w:t>Customer_ID</w:t>
+      </w:r>
+      <w:proofErr w:type="spellEnd"/>
+    </w:p>
+    <w:p>
+      <w:pPr>
+        <w:numPr>
+          <w:ilvl w:val="0"/>
+          <w:numId w:val="31"/>
+        </w:numPr>
+      </w:pPr>
+      <w:r>
+        <w:t>Observation: No transitive dependencies</w:t>
+      </w:r>
+    </w:p>
+    <w:p>
+      <w:pPr>
+        <w:numPr>
+          <w:ilvl w:val="0"/>
+          <w:numId w:val="31"/>
+        </w:numPr>
+      </w:pPr>
+      <w:r>
+        <w:t>Result: Table remains unchanged</w:t>
+      </w:r>
+    </w:p>
+    <w:p>
+      <w:r>
+        <w:t>Step 5: BOOKING Table</w:t>
+      </w:r>
+    </w:p>
+    <w:p>
+      <w:pPr>
+        <w:numPr>
+          <w:ilvl w:val="0"/>
+          <w:numId w:val="32"/>
+        </w:numPr>
+      </w:pPr>
+      <w:r>
+        <w:t>Current Form: 2NF</w:t>
+      </w:r>
+    </w:p>
+    <w:p>
+      <w:pPr>
+        <w:numPr>
+          <w:ilvl w:val="0"/>
+          <w:numId w:val="32"/>
+        </w:numPr>
+      </w:pPr>
+      <w:r>
+        <w:t xml:space="preserve">Primary Key: </w:t>
+      </w:r>
+      <w:proofErr w:type="spellStart"/>
+      <w:r>
+        <w:t>Booking_ID</w:t>
+      </w:r>
+      <w:proofErr w:type="spellEnd"/>
+    </w:p>
+    <w:p>
+      <w:pPr>
+        <w:numPr>
+          <w:ilvl w:val="0"/>
+          <w:numId w:val="32"/>
+        </w:numPr>
+      </w:pPr>
+      <w:r>
+        <w:t>Observation: No transitive dependencies</w:t>
+      </w:r>
+    </w:p>
+    <w:p>
+      <w:pPr>
+        <w:numPr>
+          <w:ilvl w:val="0"/>
+          <w:numId w:val="32"/>
+        </w:numPr>
+      </w:pPr>
+      <w:r>
+        <w:t>Result: Table remains unchanged</w:t>
+      </w:r>
+    </w:p>
+    <w:p/>
+    <w:p>
+      <w:r>
+        <w:t>Step 6: SEAT Table</w:t>
+      </w:r>
+    </w:p>
+    <w:p>
+      <w:pPr>
+        <w:numPr>
+          <w:ilvl w:val="0"/>
+          <w:numId w:val="33"/>
+        </w:numPr>
+      </w:pPr>
+      <w:r>
+        <w:t>Current Form: 2NF</w:t>
+      </w:r>
+    </w:p>
+    <w:p>
+      <w:pPr>
+        <w:numPr>
+          <w:ilvl w:val="0"/>
+          <w:numId w:val="33"/>
+        </w:numPr>
+      </w:pPr>
+      <w:r>
+        <w:t xml:space="preserve">Primary Key: </w:t>
+      </w:r>
+      <w:proofErr w:type="spellStart"/>
+      <w:r>
+        <w:t>Seat_ID</w:t>
+      </w:r>
+      <w:proofErr w:type="spellEnd"/>
+    </w:p>
+    <w:p>
+      <w:pPr>
+        <w:numPr>
+          <w:ilvl w:val="0"/>
+          <w:numId w:val="33"/>
+        </w:numPr>
+      </w:pPr>
+      <w:r>
+        <w:t>Observation: No transitive dependencies</w:t>
+      </w:r>
+    </w:p>
+    <w:p>
+      <w:pPr>
+        <w:numPr>
+          <w:ilvl w:val="0"/>
+          <w:numId w:val="33"/>
+        </w:numPr>
+      </w:pPr>
+      <w:r>
+        <w:t>Result: Table remains unchanged</w:t>
+      </w:r>
+    </w:p>
+    <w:p>
+      <w:r>
+        <w:t>Step 7: BOOKED_SEAT Table</w:t>
+      </w:r>
+    </w:p>
+    <w:p>
+      <w:pPr>
+        <w:numPr>
+          <w:ilvl w:val="0"/>
+          <w:numId w:val="34"/>
+        </w:numPr>
+      </w:pPr>
+      <w:r>
+        <w:t>Current Form: 2NF</w:t>
+      </w:r>
+    </w:p>
+    <w:p>
+      <w:pPr>
+        <w:numPr>
+          <w:ilvl w:val="0"/>
+          <w:numId w:val="34"/>
+        </w:numPr>
+      </w:pPr>
+      <w:r>
+        <w:t>Composite Primary Key: (</w:t>
+      </w:r>
+      <w:proofErr w:type="spellStart"/>
+      <w:r>
+        <w:t>Booking_ID</w:t>
       </w:r>
       <w:proofErr w:type="spellEnd"/>
       <w:r>
@@ -8088,505 +7772,142 @@
       </w:r>
       <w:proofErr w:type="spellStart"/>
       <w:r>
-        <w:t>Theater_Location</w:t>
-      </w:r>
-      <w:proofErr w:type="spellEnd"/>
-      <w:r>
-        <w:t xml:space="preserve">, </w:t>
-      </w:r>
-      <w:proofErr w:type="spellStart"/>
-      <w:r>
-        <w:t>Total_Halls</w:t>
-      </w:r>
-      <w:proofErr w:type="spellEnd"/>
-      <w:r>
-        <w:br/>
-        <w:t xml:space="preserve">transitive dependency found (Theater details depend on </w:t>
-      </w:r>
-      <w:proofErr w:type="spellStart"/>
-      <w:r>
-        <w:t>Theater_ID</w:t>
-      </w:r>
-      <w:proofErr w:type="spellEnd"/>
-      <w:r>
-        <w:t xml:space="preserve">, not on </w:t>
-      </w:r>
-      <w:proofErr w:type="spellStart"/>
-      <w:r>
-        <w:t>Hall_ID</w:t>
+        <w:t>Seat_ID</w:t>
       </w:r>
       <w:proofErr w:type="spellEnd"/>
       <w:r>
         <w:t>)</w:t>
       </w:r>
-      <w:r>
-        <w:br/>
-        <w:t>Result: </w:t>
-      </w:r>
-      <w:r>
-        <w:rPr>
-          <w:b/>
-          <w:bCs/>
-        </w:rPr>
-        <w:t>Split into two tables</w:t>
-      </w:r>
-    </w:p>
-    <w:p>
-      <w:r>
-        <w:rPr>
-          <w:b/>
-          <w:bCs/>
-        </w:rPr>
-        <w:t>THEATER</w:t>
-      </w:r>
-      <w:r>
-        <w:t> (</w:t>
-      </w:r>
-      <w:proofErr w:type="spellStart"/>
-      <w:r>
-        <w:t>Theater_ID</w:t>
-      </w:r>
-      <w:proofErr w:type="spellEnd"/>
-      <w:r>
-        <w:t xml:space="preserve">, </w:t>
-      </w:r>
-      <w:proofErr w:type="spellStart"/>
-      <w:r>
-        <w:t>Theater_Name</w:t>
-      </w:r>
-      <w:proofErr w:type="spellEnd"/>
-      <w:r>
-        <w:t xml:space="preserve">, </w:t>
-      </w:r>
-      <w:proofErr w:type="spellStart"/>
-      <w:r>
-        <w:t>Theater_Location</w:t>
-      </w:r>
-      <w:proofErr w:type="spellEnd"/>
-      <w:r>
-        <w:t xml:space="preserve">, </w:t>
-      </w:r>
-      <w:proofErr w:type="spellStart"/>
-      <w:r>
-        <w:t>Total_Halls</w:t>
-      </w:r>
-      <w:proofErr w:type="spellEnd"/>
-      <w:r>
-        <w:t>)</w:t>
-      </w:r>
-      <w:r>
-        <w:br/>
-      </w:r>
-      <w:r>
-        <w:rPr>
-          <w:b/>
-          <w:bCs/>
-        </w:rPr>
-        <w:t>HALL</w:t>
-      </w:r>
-      <w:r>
-        <w:t> (</w:t>
-      </w:r>
-      <w:proofErr w:type="spellStart"/>
-      <w:r>
-        <w:t>Hall_ID</w:t>
-      </w:r>
-      <w:proofErr w:type="spellEnd"/>
-      <w:r>
-        <w:t xml:space="preserve">, </w:t>
-      </w:r>
-      <w:proofErr w:type="spellStart"/>
-      <w:r>
-        <w:t>Theater_ID</w:t>
-      </w:r>
-      <w:proofErr w:type="spellEnd"/>
-      <w:r>
-        <w:t xml:space="preserve">, </w:t>
-      </w:r>
-      <w:proofErr w:type="spellStart"/>
-      <w:r>
-        <w:t>Hall_Number</w:t>
-      </w:r>
-      <w:proofErr w:type="spellEnd"/>
-      <w:r>
-        <w:t xml:space="preserve">, </w:t>
-      </w:r>
-      <w:proofErr w:type="spellStart"/>
-      <w:r>
-        <w:t>Hall_Capacity</w:t>
-      </w:r>
-      <w:proofErr w:type="spellEnd"/>
-      <w:r>
-        <w:t>)</w:t>
-      </w:r>
-    </w:p>
-    <w:p/>
-    <w:p>
-      <w:pPr>
-        <w:rPr>
-          <w:b/>
-          <w:bCs/>
-        </w:rPr>
-      </w:pPr>
-      <w:r>
-        <w:rPr>
-          <w:b/>
-          <w:bCs/>
-        </w:rPr>
-        <w:t>STEP 3: Check SHOW Table</w:t>
-      </w:r>
-    </w:p>
-    <w:p>
-      <w:r>
-        <w:rPr>
-          <w:b/>
-          <w:bCs/>
-        </w:rPr>
-        <w:t>SHOW (2NF)</w:t>
-      </w:r>
-      <w:r>
-        <w:br/>
+    </w:p>
+    <w:p>
+      <w:pPr>
+        <w:numPr>
+          <w:ilvl w:val="0"/>
+          <w:numId w:val="34"/>
+        </w:numPr>
+      </w:pPr>
+      <w:r>
+        <w:t>Observation: No non-key attributes, so transitive dependencies are not possible</w:t>
+      </w:r>
+    </w:p>
+    <w:p>
+      <w:pPr>
+        <w:numPr>
+          <w:ilvl w:val="0"/>
+          <w:numId w:val="34"/>
+        </w:numPr>
+      </w:pPr>
+      <w:r>
+        <w:t>Result: Table remains unchanged</w:t>
+      </w:r>
+    </w:p>
+    <w:p>
+      <w:r>
+        <w:t>Step 8: TICKET Table</w:t>
+      </w:r>
+    </w:p>
+    <w:p>
+      <w:pPr>
+        <w:numPr>
+          <w:ilvl w:val="0"/>
+          <w:numId w:val="35"/>
+        </w:numPr>
+      </w:pPr>
+      <w:r>
+        <w:t>Current Form: 2NF</w:t>
+      </w:r>
+    </w:p>
+    <w:p>
+      <w:pPr>
+        <w:numPr>
+          <w:ilvl w:val="0"/>
+          <w:numId w:val="35"/>
+        </w:numPr>
+      </w:pPr>
+      <w:r>
         <w:t xml:space="preserve">Primary Key: </w:t>
       </w:r>
       <w:proofErr w:type="spellStart"/>
       <w:r>
-        <w:t>Show_ID</w:t>
-      </w:r>
-      <w:proofErr w:type="spellEnd"/>
-      <w:r>
-        <w:br/>
-        <w:t xml:space="preserve">Check: All attributes depend directly on </w:t>
-      </w:r>
-      <w:proofErr w:type="spellStart"/>
-      <w:r>
-        <w:t>Show_ID</w:t>
-      </w:r>
-      <w:proofErr w:type="spellEnd"/>
-      <w:r>
-        <w:br/>
-        <w:t>transitive dependencies found</w:t>
-      </w:r>
-      <w:r>
-        <w:br/>
-        <w:t>Result: </w:t>
-      </w:r>
-      <w:r>
-        <w:rPr>
-          <w:b/>
-          <w:bCs/>
-        </w:rPr>
-        <w:t>Stays as is</w:t>
-      </w:r>
-    </w:p>
-    <w:p/>
-    <w:p>
-      <w:pPr>
-        <w:rPr>
-          <w:b/>
-          <w:bCs/>
-        </w:rPr>
-      </w:pPr>
-      <w:r>
-        <w:rPr>
-          <w:b/>
-          <w:bCs/>
-        </w:rPr>
-        <w:t>STEP 4: Check CUSTOMER Table</w:t>
-      </w:r>
-    </w:p>
-    <w:p>
-      <w:r>
-        <w:rPr>
-          <w:b/>
-          <w:bCs/>
-        </w:rPr>
-        <w:t>CUSTOMER (2NF)</w:t>
-      </w:r>
-      <w:r>
-        <w:br/>
+        <w:t>Ticket_ID</w:t>
+      </w:r>
+      <w:proofErr w:type="spellEnd"/>
+    </w:p>
+    <w:p>
+      <w:pPr>
+        <w:numPr>
+          <w:ilvl w:val="0"/>
+          <w:numId w:val="35"/>
+        </w:numPr>
+      </w:pPr>
+      <w:r>
+        <w:t>Observation: No transitive dependencies</w:t>
+      </w:r>
+    </w:p>
+    <w:p>
+      <w:pPr>
+        <w:numPr>
+          <w:ilvl w:val="0"/>
+          <w:numId w:val="35"/>
+        </w:numPr>
+      </w:pPr>
+      <w:r>
+        <w:t>Result: Table remains unchanged</w:t>
+      </w:r>
+    </w:p>
+    <w:p>
+      <w:r>
+        <w:t>Step 9: PAYMENT Table</w:t>
+      </w:r>
+    </w:p>
+    <w:p>
+      <w:pPr>
+        <w:numPr>
+          <w:ilvl w:val="0"/>
+          <w:numId w:val="36"/>
+        </w:numPr>
+      </w:pPr>
+      <w:r>
+        <w:t>Current Form: 2NF</w:t>
+      </w:r>
+    </w:p>
+    <w:p>
+      <w:pPr>
+        <w:numPr>
+          <w:ilvl w:val="0"/>
+          <w:numId w:val="36"/>
+        </w:numPr>
+      </w:pPr>
+      <w:r>
+        <w:lastRenderedPageBreak/>
         <w:t xml:space="preserve">Primary Key: </w:t>
       </w:r>
       <w:proofErr w:type="spellStart"/>
       <w:r>
-        <w:t>Customer_ID</w:t>
-      </w:r>
-      <w:proofErr w:type="spellEnd"/>
-      <w:r>
-        <w:br/>
-      </w:r>
-      <w:r>
-        <w:lastRenderedPageBreak/>
-        <w:t>Check: No transitive dependencies</w:t>
-      </w:r>
-      <w:r>
-        <w:br/>
-        <w:t>Result: </w:t>
-      </w:r>
-      <w:r>
-        <w:rPr>
-          <w:b/>
-          <w:bCs/>
-        </w:rPr>
-        <w:t>Stays as is</w:t>
-      </w:r>
-    </w:p>
-    <w:p/>
-    <w:p>
-      <w:pPr>
-        <w:rPr>
-          <w:b/>
-          <w:bCs/>
-        </w:rPr>
-      </w:pPr>
-      <w:r>
-        <w:rPr>
-          <w:b/>
-          <w:bCs/>
-        </w:rPr>
-        <w:t>STEP 5: Check BOOKING Table</w:t>
-      </w:r>
-    </w:p>
-    <w:p>
-      <w:r>
-        <w:rPr>
-          <w:b/>
-          <w:bCs/>
-        </w:rPr>
-        <w:t>BOOKING (2NF)</w:t>
-      </w:r>
-      <w:r>
-        <w:br/>
-        <w:t xml:space="preserve">Primary Key: </w:t>
-      </w:r>
-      <w:proofErr w:type="spellStart"/>
-      <w:r>
-        <w:t>Booking_ID</w:t>
-      </w:r>
-      <w:proofErr w:type="spellEnd"/>
-      <w:r>
-        <w:br/>
-        <w:t>Check: No transitive dependencies</w:t>
-      </w:r>
-      <w:r>
-        <w:br/>
-        <w:t>Result: </w:t>
-      </w:r>
-      <w:r>
-        <w:rPr>
-          <w:b/>
-          <w:bCs/>
-        </w:rPr>
-        <w:t>Stays as is</w:t>
-      </w:r>
-    </w:p>
-    <w:p/>
-    <w:p>
-      <w:pPr>
-        <w:rPr>
-          <w:b/>
-          <w:bCs/>
-        </w:rPr>
-      </w:pPr>
-      <w:r>
-        <w:rPr>
-          <w:b/>
-          <w:bCs/>
-        </w:rPr>
-        <w:t>STEP 6: Check SEAT Table</w:t>
-      </w:r>
-    </w:p>
-    <w:p>
-      <w:r>
-        <w:rPr>
-          <w:b/>
-          <w:bCs/>
-        </w:rPr>
-        <w:t>SEAT (2NF)</w:t>
-      </w:r>
-      <w:r>
-        <w:br/>
-        <w:t xml:space="preserve">Primary Key: </w:t>
-      </w:r>
-      <w:proofErr w:type="spellStart"/>
-      <w:r>
-        <w:t>Seat_ID</w:t>
-      </w:r>
-      <w:proofErr w:type="spellEnd"/>
-      <w:r>
-        <w:br/>
-        <w:t>Check: No transitive dependencies</w:t>
-      </w:r>
-      <w:r>
-        <w:br/>
-        <w:t>Result: </w:t>
-      </w:r>
-      <w:r>
-        <w:rPr>
-          <w:b/>
-          <w:bCs/>
-        </w:rPr>
-        <w:t>Stays as is</w:t>
-      </w:r>
-    </w:p>
-    <w:p/>
-    <w:p>
-      <w:pPr>
-        <w:rPr>
-          <w:b/>
-          <w:bCs/>
-        </w:rPr>
-      </w:pPr>
-      <w:r>
-        <w:rPr>
-          <w:b/>
-          <w:bCs/>
-        </w:rPr>
-        <w:t>STEP 7: Check BOOKED_SEAT Table</w:t>
-      </w:r>
-    </w:p>
-    <w:p>
-      <w:r>
-        <w:rPr>
-          <w:b/>
-          <w:bCs/>
-        </w:rPr>
-        <w:t>BOOKED_SEAT (2NF)</w:t>
-      </w:r>
-      <w:r>
-        <w:br/>
-        <w:t>Composite Primary Key: (</w:t>
-      </w:r>
-      <w:proofErr w:type="spellStart"/>
-      <w:r>
-        <w:t>Booking_ID</w:t>
-      </w:r>
-      <w:proofErr w:type="spellEnd"/>
-      <w:r>
-        <w:t xml:space="preserve">, </w:t>
-      </w:r>
-      <w:proofErr w:type="spellStart"/>
-      <w:r>
-        <w:t>Seat_ID</w:t>
-      </w:r>
-      <w:proofErr w:type="spellEnd"/>
-      <w:r>
-        <w:t>)</w:t>
-      </w:r>
-      <w:r>
-        <w:br/>
-        <w:t>Check: No non-key attributes = no transitive dependencies possible</w:t>
-      </w:r>
-      <w:r>
-        <w:br/>
-        <w:t>Result: </w:t>
-      </w:r>
-      <w:r>
-        <w:rPr>
-          <w:b/>
-          <w:bCs/>
-        </w:rPr>
-        <w:t>Stays as is</w:t>
-      </w:r>
-    </w:p>
-    <w:p/>
-    <w:p>
-      <w:pPr>
-        <w:rPr>
-          <w:b/>
-          <w:bCs/>
-        </w:rPr>
-      </w:pPr>
-      <w:r>
-        <w:rPr>
-          <w:b/>
-          <w:bCs/>
-        </w:rPr>
-        <w:t>STEP 8: Check TICKET Table</w:t>
-      </w:r>
-    </w:p>
-    <w:p>
-      <w:r>
-        <w:rPr>
-          <w:b/>
-          <w:bCs/>
-        </w:rPr>
-        <w:t>TICKET (2NF)</w:t>
-      </w:r>
-      <w:r>
-        <w:br/>
-        <w:t xml:space="preserve">Primary Key: </w:t>
-      </w:r>
-      <w:proofErr w:type="spellStart"/>
-      <w:r>
-        <w:t>Ticket_ID</w:t>
-      </w:r>
-      <w:proofErr w:type="spellEnd"/>
-      <w:r>
-        <w:br/>
-        <w:t>Check: No transitive dependencies</w:t>
-      </w:r>
-      <w:r>
-        <w:br/>
-        <w:t>Result: </w:t>
-      </w:r>
-      <w:r>
-        <w:rPr>
-          <w:b/>
-          <w:bCs/>
-        </w:rPr>
-        <w:t>Stays as is</w:t>
-      </w:r>
-    </w:p>
-    <w:p/>
-    <w:p>
-      <w:pPr>
-        <w:rPr>
-          <w:b/>
-          <w:bCs/>
-        </w:rPr>
-      </w:pPr>
-      <w:r>
-        <w:rPr>
-          <w:b/>
-          <w:bCs/>
-        </w:rPr>
-        <w:t>STEP 9: Check PAYMENT Table</w:t>
-      </w:r>
-    </w:p>
-    <w:p>
-      <w:r>
-        <w:rPr>
-          <w:b/>
-          <w:bCs/>
-        </w:rPr>
-        <w:t>PAYMENT (2NF)</w:t>
-      </w:r>
-      <w:r>
-        <w:br/>
-        <w:t xml:space="preserve">Primary Key: </w:t>
-      </w:r>
-      <w:proofErr w:type="spellStart"/>
-      <w:r>
         <w:t>Payment_ID</w:t>
       </w:r>
       <w:proofErr w:type="spellEnd"/>
-      <w:r>
-        <w:br/>
-      </w:r>
-      <w:r>
-        <w:lastRenderedPageBreak/>
-        <w:t>Check: No transitive dependencies</w:t>
-      </w:r>
-      <w:r>
-        <w:br/>
-        <w:t>Result: </w:t>
-      </w:r>
-      <w:r>
-        <w:rPr>
-          <w:b/>
-          <w:bCs/>
-        </w:rPr>
-        <w:t>Stays as is</w:t>
+    </w:p>
+    <w:p>
+      <w:pPr>
+        <w:numPr>
+          <w:ilvl w:val="0"/>
+          <w:numId w:val="36"/>
+        </w:numPr>
+      </w:pPr>
+      <w:r>
+        <w:t>Observation: No transitive dependencies</w:t>
+      </w:r>
+    </w:p>
+    <w:p>
+      <w:pPr>
+        <w:numPr>
+          <w:ilvl w:val="0"/>
+          <w:numId w:val="36"/>
+        </w:numPr>
+      </w:pPr>
+      <w:r>
+        <w:t>Result: Table remains unchanged</w:t>
       </w:r>
     </w:p>
     <w:p>
@@ -9513,6 +8834,304 @@
     </w:lvl>
   </w:abstractNum>
   <w:abstractNum w:abstractNumId="3" w15:restartNumberingAfterBreak="0">
+    <w:nsid w:val="09B765A7"/>
+    <w:multiLevelType w:val="multilevel"/>
+    <w:tmpl w:val="17B03760"/>
+    <w:lvl w:ilvl="0">
+      <w:start w:val="1"/>
+      <w:numFmt w:val="bullet"/>
+      <w:lvlText w:val=""/>
+      <w:lvlJc w:val="left"/>
+      <w:pPr>
+        <w:tabs>
+          <w:tab w:val="num" w:pos="720"/>
+        </w:tabs>
+        <w:ind w:left="720" w:hanging="360"/>
+      </w:pPr>
+      <w:rPr>
+        <w:rFonts w:ascii="Symbol" w:hAnsi="Symbol" w:hint="default"/>
+        <w:sz w:val="20"/>
+      </w:rPr>
+    </w:lvl>
+    <w:lvl w:ilvl="1" w:tentative="1">
+      <w:start w:val="1"/>
+      <w:numFmt w:val="bullet"/>
+      <w:lvlText w:val="o"/>
+      <w:lvlJc w:val="left"/>
+      <w:pPr>
+        <w:tabs>
+          <w:tab w:val="num" w:pos="1440"/>
+        </w:tabs>
+        <w:ind w:left="1440" w:hanging="360"/>
+      </w:pPr>
+      <w:rPr>
+        <w:rFonts w:ascii="Courier New" w:hAnsi="Courier New" w:hint="default"/>
+        <w:sz w:val="20"/>
+      </w:rPr>
+    </w:lvl>
+    <w:lvl w:ilvl="2" w:tentative="1">
+      <w:start w:val="1"/>
+      <w:numFmt w:val="bullet"/>
+      <w:lvlText w:val=""/>
+      <w:lvlJc w:val="left"/>
+      <w:pPr>
+        <w:tabs>
+          <w:tab w:val="num" w:pos="2160"/>
+        </w:tabs>
+        <w:ind w:left="2160" w:hanging="360"/>
+      </w:pPr>
+      <w:rPr>
+        <w:rFonts w:ascii="Wingdings" w:hAnsi="Wingdings" w:hint="default"/>
+        <w:sz w:val="20"/>
+      </w:rPr>
+    </w:lvl>
+    <w:lvl w:ilvl="3" w:tentative="1">
+      <w:start w:val="1"/>
+      <w:numFmt w:val="bullet"/>
+      <w:lvlText w:val=""/>
+      <w:lvlJc w:val="left"/>
+      <w:pPr>
+        <w:tabs>
+          <w:tab w:val="num" w:pos="2880"/>
+        </w:tabs>
+        <w:ind w:left="2880" w:hanging="360"/>
+      </w:pPr>
+      <w:rPr>
+        <w:rFonts w:ascii="Wingdings" w:hAnsi="Wingdings" w:hint="default"/>
+        <w:sz w:val="20"/>
+      </w:rPr>
+    </w:lvl>
+    <w:lvl w:ilvl="4" w:tentative="1">
+      <w:start w:val="1"/>
+      <w:numFmt w:val="bullet"/>
+      <w:lvlText w:val=""/>
+      <w:lvlJc w:val="left"/>
+      <w:pPr>
+        <w:tabs>
+          <w:tab w:val="num" w:pos="3600"/>
+        </w:tabs>
+        <w:ind w:left="3600" w:hanging="360"/>
+      </w:pPr>
+      <w:rPr>
+        <w:rFonts w:ascii="Wingdings" w:hAnsi="Wingdings" w:hint="default"/>
+        <w:sz w:val="20"/>
+      </w:rPr>
+    </w:lvl>
+    <w:lvl w:ilvl="5" w:tentative="1">
+      <w:start w:val="1"/>
+      <w:numFmt w:val="bullet"/>
+      <w:lvlText w:val=""/>
+      <w:lvlJc w:val="left"/>
+      <w:pPr>
+        <w:tabs>
+          <w:tab w:val="num" w:pos="4320"/>
+        </w:tabs>
+        <w:ind w:left="4320" w:hanging="360"/>
+      </w:pPr>
+      <w:rPr>
+        <w:rFonts w:ascii="Wingdings" w:hAnsi="Wingdings" w:hint="default"/>
+        <w:sz w:val="20"/>
+      </w:rPr>
+    </w:lvl>
+    <w:lvl w:ilvl="6" w:tentative="1">
+      <w:start w:val="1"/>
+      <w:numFmt w:val="bullet"/>
+      <w:lvlText w:val=""/>
+      <w:lvlJc w:val="left"/>
+      <w:pPr>
+        <w:tabs>
+          <w:tab w:val="num" w:pos="5040"/>
+        </w:tabs>
+        <w:ind w:left="5040" w:hanging="360"/>
+      </w:pPr>
+      <w:rPr>
+        <w:rFonts w:ascii="Wingdings" w:hAnsi="Wingdings" w:hint="default"/>
+        <w:sz w:val="20"/>
+      </w:rPr>
+    </w:lvl>
+    <w:lvl w:ilvl="7" w:tentative="1">
+      <w:start w:val="1"/>
+      <w:numFmt w:val="bullet"/>
+      <w:lvlText w:val=""/>
+      <w:lvlJc w:val="left"/>
+      <w:pPr>
+        <w:tabs>
+          <w:tab w:val="num" w:pos="5760"/>
+        </w:tabs>
+        <w:ind w:left="5760" w:hanging="360"/>
+      </w:pPr>
+      <w:rPr>
+        <w:rFonts w:ascii="Wingdings" w:hAnsi="Wingdings" w:hint="default"/>
+        <w:sz w:val="20"/>
+      </w:rPr>
+    </w:lvl>
+    <w:lvl w:ilvl="8" w:tentative="1">
+      <w:start w:val="1"/>
+      <w:numFmt w:val="bullet"/>
+      <w:lvlText w:val=""/>
+      <w:lvlJc w:val="left"/>
+      <w:pPr>
+        <w:tabs>
+          <w:tab w:val="num" w:pos="6480"/>
+        </w:tabs>
+        <w:ind w:left="6480" w:hanging="360"/>
+      </w:pPr>
+      <w:rPr>
+        <w:rFonts w:ascii="Wingdings" w:hAnsi="Wingdings" w:hint="default"/>
+        <w:sz w:val="20"/>
+      </w:rPr>
+    </w:lvl>
+  </w:abstractNum>
+  <w:abstractNum w:abstractNumId="4" w15:restartNumberingAfterBreak="0">
+    <w:nsid w:val="0BEA468C"/>
+    <w:multiLevelType w:val="multilevel"/>
+    <w:tmpl w:val="742639B2"/>
+    <w:lvl w:ilvl="0">
+      <w:start w:val="1"/>
+      <w:numFmt w:val="bullet"/>
+      <w:lvlText w:val=""/>
+      <w:lvlJc w:val="left"/>
+      <w:pPr>
+        <w:tabs>
+          <w:tab w:val="num" w:pos="720"/>
+        </w:tabs>
+        <w:ind w:left="720" w:hanging="360"/>
+      </w:pPr>
+      <w:rPr>
+        <w:rFonts w:ascii="Symbol" w:hAnsi="Symbol" w:hint="default"/>
+        <w:sz w:val="20"/>
+      </w:rPr>
+    </w:lvl>
+    <w:lvl w:ilvl="1" w:tentative="1">
+      <w:start w:val="1"/>
+      <w:numFmt w:val="bullet"/>
+      <w:lvlText w:val="o"/>
+      <w:lvlJc w:val="left"/>
+      <w:pPr>
+        <w:tabs>
+          <w:tab w:val="num" w:pos="1440"/>
+        </w:tabs>
+        <w:ind w:left="1440" w:hanging="360"/>
+      </w:pPr>
+      <w:rPr>
+        <w:rFonts w:ascii="Courier New" w:hAnsi="Courier New" w:hint="default"/>
+        <w:sz w:val="20"/>
+      </w:rPr>
+    </w:lvl>
+    <w:lvl w:ilvl="2" w:tentative="1">
+      <w:start w:val="1"/>
+      <w:numFmt w:val="bullet"/>
+      <w:lvlText w:val=""/>
+      <w:lvlJc w:val="left"/>
+      <w:pPr>
+        <w:tabs>
+          <w:tab w:val="num" w:pos="2160"/>
+        </w:tabs>
+        <w:ind w:left="2160" w:hanging="360"/>
+      </w:pPr>
+      <w:rPr>
+        <w:rFonts w:ascii="Wingdings" w:hAnsi="Wingdings" w:hint="default"/>
+        <w:sz w:val="20"/>
+      </w:rPr>
+    </w:lvl>
+    <w:lvl w:ilvl="3" w:tentative="1">
+      <w:start w:val="1"/>
+      <w:numFmt w:val="bullet"/>
+      <w:lvlText w:val=""/>
+      <w:lvlJc w:val="left"/>
+      <w:pPr>
+        <w:tabs>
+          <w:tab w:val="num" w:pos="2880"/>
+        </w:tabs>
+        <w:ind w:left="2880" w:hanging="360"/>
+      </w:pPr>
+      <w:rPr>
+        <w:rFonts w:ascii="Wingdings" w:hAnsi="Wingdings" w:hint="default"/>
+        <w:sz w:val="20"/>
+      </w:rPr>
+    </w:lvl>
+    <w:lvl w:ilvl="4" w:tentative="1">
+      <w:start w:val="1"/>
+      <w:numFmt w:val="bullet"/>
+      <w:lvlText w:val=""/>
+      <w:lvlJc w:val="left"/>
+      <w:pPr>
+        <w:tabs>
+          <w:tab w:val="num" w:pos="3600"/>
+        </w:tabs>
+        <w:ind w:left="3600" w:hanging="360"/>
+      </w:pPr>
+      <w:rPr>
+        <w:rFonts w:ascii="Wingdings" w:hAnsi="Wingdings" w:hint="default"/>
+        <w:sz w:val="20"/>
+      </w:rPr>
+    </w:lvl>
+    <w:lvl w:ilvl="5" w:tentative="1">
+      <w:start w:val="1"/>
+      <w:numFmt w:val="bullet"/>
+      <w:lvlText w:val=""/>
+      <w:lvlJc w:val="left"/>
+      <w:pPr>
+        <w:tabs>
+          <w:tab w:val="num" w:pos="4320"/>
+        </w:tabs>
+        <w:ind w:left="4320" w:hanging="360"/>
+      </w:pPr>
+      <w:rPr>
+        <w:rFonts w:ascii="Wingdings" w:hAnsi="Wingdings" w:hint="default"/>
+        <w:sz w:val="20"/>
+      </w:rPr>
+    </w:lvl>
+    <w:lvl w:ilvl="6" w:tentative="1">
+      <w:start w:val="1"/>
+      <w:numFmt w:val="bullet"/>
+      <w:lvlText w:val=""/>
+      <w:lvlJc w:val="left"/>
+      <w:pPr>
+        <w:tabs>
+          <w:tab w:val="num" w:pos="5040"/>
+        </w:tabs>
+        <w:ind w:left="5040" w:hanging="360"/>
+      </w:pPr>
+      <w:rPr>
+        <w:rFonts w:ascii="Wingdings" w:hAnsi="Wingdings" w:hint="default"/>
+        <w:sz w:val="20"/>
+      </w:rPr>
+    </w:lvl>
+    <w:lvl w:ilvl="7" w:tentative="1">
+      <w:start w:val="1"/>
+      <w:numFmt w:val="bullet"/>
+      <w:lvlText w:val=""/>
+      <w:lvlJc w:val="left"/>
+      <w:pPr>
+        <w:tabs>
+          <w:tab w:val="num" w:pos="5760"/>
+        </w:tabs>
+        <w:ind w:left="5760" w:hanging="360"/>
+      </w:pPr>
+      <w:rPr>
+        <w:rFonts w:ascii="Wingdings" w:hAnsi="Wingdings" w:hint="default"/>
+        <w:sz w:val="20"/>
+      </w:rPr>
+    </w:lvl>
+    <w:lvl w:ilvl="8" w:tentative="1">
+      <w:start w:val="1"/>
+      <w:numFmt w:val="bullet"/>
+      <w:lvlText w:val=""/>
+      <w:lvlJc w:val="left"/>
+      <w:pPr>
+        <w:tabs>
+          <w:tab w:val="num" w:pos="6480"/>
+        </w:tabs>
+        <w:ind w:left="6480" w:hanging="360"/>
+      </w:pPr>
+      <w:rPr>
+        <w:rFonts w:ascii="Wingdings" w:hAnsi="Wingdings" w:hint="default"/>
+        <w:sz w:val="20"/>
+      </w:rPr>
+    </w:lvl>
+  </w:abstractNum>
+  <w:abstractNum w:abstractNumId="5" w15:restartNumberingAfterBreak="0">
     <w:nsid w:val="0C247EF4"/>
     <w:multiLevelType w:val="multilevel"/>
     <w:tmpl w:val="486CD77C"/>
@@ -9625,7 +9244,7 @@
       </w:pPr>
     </w:lvl>
   </w:abstractNum>
-  <w:abstractNum w:abstractNumId="4" w15:restartNumberingAfterBreak="0">
+  <w:abstractNum w:abstractNumId="6" w15:restartNumberingAfterBreak="0">
     <w:nsid w:val="13F967A1"/>
     <w:multiLevelType w:val="multilevel"/>
     <w:tmpl w:val="A64E82FC"/>
@@ -9774,7 +9393,7 @@
       </w:rPr>
     </w:lvl>
   </w:abstractNum>
-  <w:abstractNum w:abstractNumId="5" w15:restartNumberingAfterBreak="0">
+  <w:abstractNum w:abstractNumId="7" w15:restartNumberingAfterBreak="0">
     <w:nsid w:val="1E3103EB"/>
     <w:multiLevelType w:val="multilevel"/>
     <w:tmpl w:val="FEC6B9E0"/>
@@ -9923,7 +9542,7 @@
       </w:rPr>
     </w:lvl>
   </w:abstractNum>
-  <w:abstractNum w:abstractNumId="6" w15:restartNumberingAfterBreak="0">
+  <w:abstractNum w:abstractNumId="8" w15:restartNumberingAfterBreak="0">
     <w:nsid w:val="23942E96"/>
     <w:multiLevelType w:val="multilevel"/>
     <w:tmpl w:val="B84270A0"/>
@@ -10072,7 +9691,7 @@
       </w:rPr>
     </w:lvl>
   </w:abstractNum>
-  <w:abstractNum w:abstractNumId="7" w15:restartNumberingAfterBreak="0">
+  <w:abstractNum w:abstractNumId="9" w15:restartNumberingAfterBreak="0">
     <w:nsid w:val="244C2763"/>
     <w:multiLevelType w:val="multilevel"/>
     <w:tmpl w:val="9A30A810"/>
@@ -10221,7 +9840,7 @@
       </w:rPr>
     </w:lvl>
   </w:abstractNum>
-  <w:abstractNum w:abstractNumId="8" w15:restartNumberingAfterBreak="0">
+  <w:abstractNum w:abstractNumId="10" w15:restartNumberingAfterBreak="0">
     <w:nsid w:val="27425A61"/>
     <w:multiLevelType w:val="multilevel"/>
     <w:tmpl w:val="0D44382E"/>
@@ -10334,7 +9953,7 @@
       </w:pPr>
     </w:lvl>
   </w:abstractNum>
-  <w:abstractNum w:abstractNumId="9" w15:restartNumberingAfterBreak="0">
+  <w:abstractNum w:abstractNumId="11" w15:restartNumberingAfterBreak="0">
     <w:nsid w:val="2B593383"/>
     <w:multiLevelType w:val="multilevel"/>
     <w:tmpl w:val="E6D2996C"/>
@@ -10483,7 +10102,7 @@
       </w:rPr>
     </w:lvl>
   </w:abstractNum>
-  <w:abstractNum w:abstractNumId="10" w15:restartNumberingAfterBreak="0">
+  <w:abstractNum w:abstractNumId="12" w15:restartNumberingAfterBreak="0">
     <w:nsid w:val="308C1A07"/>
     <w:multiLevelType w:val="multilevel"/>
     <w:tmpl w:val="43AA2C8C"/>
@@ -10632,7 +10251,7 @@
       </w:rPr>
     </w:lvl>
   </w:abstractNum>
-  <w:abstractNum w:abstractNumId="11" w15:restartNumberingAfterBreak="0">
+  <w:abstractNum w:abstractNumId="13" w15:restartNumberingAfterBreak="0">
     <w:nsid w:val="36064852"/>
     <w:multiLevelType w:val="multilevel"/>
     <w:tmpl w:val="7DFA74CE"/>
@@ -10745,7 +10364,305 @@
       </w:pPr>
     </w:lvl>
   </w:abstractNum>
-  <w:abstractNum w:abstractNumId="12" w15:restartNumberingAfterBreak="0">
+  <w:abstractNum w:abstractNumId="14" w15:restartNumberingAfterBreak="0">
+    <w:nsid w:val="3C402A61"/>
+    <w:multiLevelType w:val="multilevel"/>
+    <w:tmpl w:val="127A495E"/>
+    <w:lvl w:ilvl="0">
+      <w:start w:val="1"/>
+      <w:numFmt w:val="bullet"/>
+      <w:lvlText w:val=""/>
+      <w:lvlJc w:val="left"/>
+      <w:pPr>
+        <w:tabs>
+          <w:tab w:val="num" w:pos="720"/>
+        </w:tabs>
+        <w:ind w:left="720" w:hanging="360"/>
+      </w:pPr>
+      <w:rPr>
+        <w:rFonts w:ascii="Symbol" w:hAnsi="Symbol" w:hint="default"/>
+        <w:sz w:val="20"/>
+      </w:rPr>
+    </w:lvl>
+    <w:lvl w:ilvl="1" w:tentative="1">
+      <w:start w:val="1"/>
+      <w:numFmt w:val="bullet"/>
+      <w:lvlText w:val="o"/>
+      <w:lvlJc w:val="left"/>
+      <w:pPr>
+        <w:tabs>
+          <w:tab w:val="num" w:pos="1440"/>
+        </w:tabs>
+        <w:ind w:left="1440" w:hanging="360"/>
+      </w:pPr>
+      <w:rPr>
+        <w:rFonts w:ascii="Courier New" w:hAnsi="Courier New" w:hint="default"/>
+        <w:sz w:val="20"/>
+      </w:rPr>
+    </w:lvl>
+    <w:lvl w:ilvl="2" w:tentative="1">
+      <w:start w:val="1"/>
+      <w:numFmt w:val="bullet"/>
+      <w:lvlText w:val=""/>
+      <w:lvlJc w:val="left"/>
+      <w:pPr>
+        <w:tabs>
+          <w:tab w:val="num" w:pos="2160"/>
+        </w:tabs>
+        <w:ind w:left="2160" w:hanging="360"/>
+      </w:pPr>
+      <w:rPr>
+        <w:rFonts w:ascii="Wingdings" w:hAnsi="Wingdings" w:hint="default"/>
+        <w:sz w:val="20"/>
+      </w:rPr>
+    </w:lvl>
+    <w:lvl w:ilvl="3" w:tentative="1">
+      <w:start w:val="1"/>
+      <w:numFmt w:val="bullet"/>
+      <w:lvlText w:val=""/>
+      <w:lvlJc w:val="left"/>
+      <w:pPr>
+        <w:tabs>
+          <w:tab w:val="num" w:pos="2880"/>
+        </w:tabs>
+        <w:ind w:left="2880" w:hanging="360"/>
+      </w:pPr>
+      <w:rPr>
+        <w:rFonts w:ascii="Wingdings" w:hAnsi="Wingdings" w:hint="default"/>
+        <w:sz w:val="20"/>
+      </w:rPr>
+    </w:lvl>
+    <w:lvl w:ilvl="4" w:tentative="1">
+      <w:start w:val="1"/>
+      <w:numFmt w:val="bullet"/>
+      <w:lvlText w:val=""/>
+      <w:lvlJc w:val="left"/>
+      <w:pPr>
+        <w:tabs>
+          <w:tab w:val="num" w:pos="3600"/>
+        </w:tabs>
+        <w:ind w:left="3600" w:hanging="360"/>
+      </w:pPr>
+      <w:rPr>
+        <w:rFonts w:ascii="Wingdings" w:hAnsi="Wingdings" w:hint="default"/>
+        <w:sz w:val="20"/>
+      </w:rPr>
+    </w:lvl>
+    <w:lvl w:ilvl="5" w:tentative="1">
+      <w:start w:val="1"/>
+      <w:numFmt w:val="bullet"/>
+      <w:lvlText w:val=""/>
+      <w:lvlJc w:val="left"/>
+      <w:pPr>
+        <w:tabs>
+          <w:tab w:val="num" w:pos="4320"/>
+        </w:tabs>
+        <w:ind w:left="4320" w:hanging="360"/>
+      </w:pPr>
+      <w:rPr>
+        <w:rFonts w:ascii="Wingdings" w:hAnsi="Wingdings" w:hint="default"/>
+        <w:sz w:val="20"/>
+      </w:rPr>
+    </w:lvl>
+    <w:lvl w:ilvl="6" w:tentative="1">
+      <w:start w:val="1"/>
+      <w:numFmt w:val="bullet"/>
+      <w:lvlText w:val=""/>
+      <w:lvlJc w:val="left"/>
+      <w:pPr>
+        <w:tabs>
+          <w:tab w:val="num" w:pos="5040"/>
+        </w:tabs>
+        <w:ind w:left="5040" w:hanging="360"/>
+      </w:pPr>
+      <w:rPr>
+        <w:rFonts w:ascii="Wingdings" w:hAnsi="Wingdings" w:hint="default"/>
+        <w:sz w:val="20"/>
+      </w:rPr>
+    </w:lvl>
+    <w:lvl w:ilvl="7" w:tentative="1">
+      <w:start w:val="1"/>
+      <w:numFmt w:val="bullet"/>
+      <w:lvlText w:val=""/>
+      <w:lvlJc w:val="left"/>
+      <w:pPr>
+        <w:tabs>
+          <w:tab w:val="num" w:pos="5760"/>
+        </w:tabs>
+        <w:ind w:left="5760" w:hanging="360"/>
+      </w:pPr>
+      <w:rPr>
+        <w:rFonts w:ascii="Wingdings" w:hAnsi="Wingdings" w:hint="default"/>
+        <w:sz w:val="20"/>
+      </w:rPr>
+    </w:lvl>
+    <w:lvl w:ilvl="8" w:tentative="1">
+      <w:start w:val="1"/>
+      <w:numFmt w:val="bullet"/>
+      <w:lvlText w:val=""/>
+      <w:lvlJc w:val="left"/>
+      <w:pPr>
+        <w:tabs>
+          <w:tab w:val="num" w:pos="6480"/>
+        </w:tabs>
+        <w:ind w:left="6480" w:hanging="360"/>
+      </w:pPr>
+      <w:rPr>
+        <w:rFonts w:ascii="Wingdings" w:hAnsi="Wingdings" w:hint="default"/>
+        <w:sz w:val="20"/>
+      </w:rPr>
+    </w:lvl>
+  </w:abstractNum>
+  <w:abstractNum w:abstractNumId="15" w15:restartNumberingAfterBreak="0">
+    <w:nsid w:val="3F1848BE"/>
+    <w:multiLevelType w:val="multilevel"/>
+    <w:tmpl w:val="C7161DF4"/>
+    <w:lvl w:ilvl="0">
+      <w:start w:val="1"/>
+      <w:numFmt w:val="bullet"/>
+      <w:lvlText w:val=""/>
+      <w:lvlJc w:val="left"/>
+      <w:pPr>
+        <w:tabs>
+          <w:tab w:val="num" w:pos="720"/>
+        </w:tabs>
+        <w:ind w:left="720" w:hanging="360"/>
+      </w:pPr>
+      <w:rPr>
+        <w:rFonts w:ascii="Symbol" w:hAnsi="Symbol" w:hint="default"/>
+        <w:sz w:val="20"/>
+      </w:rPr>
+    </w:lvl>
+    <w:lvl w:ilvl="1" w:tentative="1">
+      <w:start w:val="1"/>
+      <w:numFmt w:val="bullet"/>
+      <w:lvlText w:val="o"/>
+      <w:lvlJc w:val="left"/>
+      <w:pPr>
+        <w:tabs>
+          <w:tab w:val="num" w:pos="1440"/>
+        </w:tabs>
+        <w:ind w:left="1440" w:hanging="360"/>
+      </w:pPr>
+      <w:rPr>
+        <w:rFonts w:ascii="Courier New" w:hAnsi="Courier New" w:hint="default"/>
+        <w:sz w:val="20"/>
+      </w:rPr>
+    </w:lvl>
+    <w:lvl w:ilvl="2" w:tentative="1">
+      <w:start w:val="1"/>
+      <w:numFmt w:val="bullet"/>
+      <w:lvlText w:val=""/>
+      <w:lvlJc w:val="left"/>
+      <w:pPr>
+        <w:tabs>
+          <w:tab w:val="num" w:pos="2160"/>
+        </w:tabs>
+        <w:ind w:left="2160" w:hanging="360"/>
+      </w:pPr>
+      <w:rPr>
+        <w:rFonts w:ascii="Wingdings" w:hAnsi="Wingdings" w:hint="default"/>
+        <w:sz w:val="20"/>
+      </w:rPr>
+    </w:lvl>
+    <w:lvl w:ilvl="3" w:tentative="1">
+      <w:start w:val="1"/>
+      <w:numFmt w:val="bullet"/>
+      <w:lvlText w:val=""/>
+      <w:lvlJc w:val="left"/>
+      <w:pPr>
+        <w:tabs>
+          <w:tab w:val="num" w:pos="2880"/>
+        </w:tabs>
+        <w:ind w:left="2880" w:hanging="360"/>
+      </w:pPr>
+      <w:rPr>
+        <w:rFonts w:ascii="Wingdings" w:hAnsi="Wingdings" w:hint="default"/>
+        <w:sz w:val="20"/>
+      </w:rPr>
+    </w:lvl>
+    <w:lvl w:ilvl="4" w:tentative="1">
+      <w:start w:val="1"/>
+      <w:numFmt w:val="bullet"/>
+      <w:lvlText w:val=""/>
+      <w:lvlJc w:val="left"/>
+      <w:pPr>
+        <w:tabs>
+          <w:tab w:val="num" w:pos="3600"/>
+        </w:tabs>
+        <w:ind w:left="3600" w:hanging="360"/>
+      </w:pPr>
+      <w:rPr>
+        <w:rFonts w:ascii="Wingdings" w:hAnsi="Wingdings" w:hint="default"/>
+        <w:sz w:val="20"/>
+      </w:rPr>
+    </w:lvl>
+    <w:lvl w:ilvl="5" w:tentative="1">
+      <w:start w:val="1"/>
+      <w:numFmt w:val="bullet"/>
+      <w:lvlText w:val=""/>
+      <w:lvlJc w:val="left"/>
+      <w:pPr>
+        <w:tabs>
+          <w:tab w:val="num" w:pos="4320"/>
+        </w:tabs>
+        <w:ind w:left="4320" w:hanging="360"/>
+      </w:pPr>
+      <w:rPr>
+        <w:rFonts w:ascii="Wingdings" w:hAnsi="Wingdings" w:hint="default"/>
+        <w:sz w:val="20"/>
+      </w:rPr>
+    </w:lvl>
+    <w:lvl w:ilvl="6" w:tentative="1">
+      <w:start w:val="1"/>
+      <w:numFmt w:val="bullet"/>
+      <w:lvlText w:val=""/>
+      <w:lvlJc w:val="left"/>
+      <w:pPr>
+        <w:tabs>
+          <w:tab w:val="num" w:pos="5040"/>
+        </w:tabs>
+        <w:ind w:left="5040" w:hanging="360"/>
+      </w:pPr>
+      <w:rPr>
+        <w:rFonts w:ascii="Wingdings" w:hAnsi="Wingdings" w:hint="default"/>
+        <w:sz w:val="20"/>
+      </w:rPr>
+    </w:lvl>
+    <w:lvl w:ilvl="7" w:tentative="1">
+      <w:start w:val="1"/>
+      <w:numFmt w:val="bullet"/>
+      <w:lvlText w:val=""/>
+      <w:lvlJc w:val="left"/>
+      <w:pPr>
+        <w:tabs>
+          <w:tab w:val="num" w:pos="5760"/>
+        </w:tabs>
+        <w:ind w:left="5760" w:hanging="360"/>
+      </w:pPr>
+      <w:rPr>
+        <w:rFonts w:ascii="Wingdings" w:hAnsi="Wingdings" w:hint="default"/>
+        <w:sz w:val="20"/>
+      </w:rPr>
+    </w:lvl>
+    <w:lvl w:ilvl="8" w:tentative="1">
+      <w:start w:val="1"/>
+      <w:numFmt w:val="bullet"/>
+      <w:lvlText w:val=""/>
+      <w:lvlJc w:val="left"/>
+      <w:pPr>
+        <w:tabs>
+          <w:tab w:val="num" w:pos="6480"/>
+        </w:tabs>
+        <w:ind w:left="6480" w:hanging="360"/>
+      </w:pPr>
+      <w:rPr>
+        <w:rFonts w:ascii="Wingdings" w:hAnsi="Wingdings" w:hint="default"/>
+        <w:sz w:val="20"/>
+      </w:rPr>
+    </w:lvl>
+  </w:abstractNum>
+  <w:abstractNum w:abstractNumId="16" w15:restartNumberingAfterBreak="0">
     <w:nsid w:val="40F00B24"/>
     <w:multiLevelType w:val="multilevel"/>
     <w:tmpl w:val="3850C366"/>
@@ -10858,7 +10775,156 @@
       </w:pPr>
     </w:lvl>
   </w:abstractNum>
-  <w:abstractNum w:abstractNumId="13" w15:restartNumberingAfterBreak="0">
+  <w:abstractNum w:abstractNumId="17" w15:restartNumberingAfterBreak="0">
+    <w:nsid w:val="451D33BA"/>
+    <w:multiLevelType w:val="multilevel"/>
+    <w:tmpl w:val="352679BC"/>
+    <w:lvl w:ilvl="0">
+      <w:start w:val="1"/>
+      <w:numFmt w:val="bullet"/>
+      <w:lvlText w:val=""/>
+      <w:lvlJc w:val="left"/>
+      <w:pPr>
+        <w:tabs>
+          <w:tab w:val="num" w:pos="720"/>
+        </w:tabs>
+        <w:ind w:left="720" w:hanging="360"/>
+      </w:pPr>
+      <w:rPr>
+        <w:rFonts w:ascii="Symbol" w:hAnsi="Symbol" w:hint="default"/>
+        <w:sz w:val="20"/>
+      </w:rPr>
+    </w:lvl>
+    <w:lvl w:ilvl="1" w:tentative="1">
+      <w:start w:val="1"/>
+      <w:numFmt w:val="bullet"/>
+      <w:lvlText w:val="o"/>
+      <w:lvlJc w:val="left"/>
+      <w:pPr>
+        <w:tabs>
+          <w:tab w:val="num" w:pos="1440"/>
+        </w:tabs>
+        <w:ind w:left="1440" w:hanging="360"/>
+      </w:pPr>
+      <w:rPr>
+        <w:rFonts w:ascii="Courier New" w:hAnsi="Courier New" w:hint="default"/>
+        <w:sz w:val="20"/>
+      </w:rPr>
+    </w:lvl>
+    <w:lvl w:ilvl="2" w:tentative="1">
+      <w:start w:val="1"/>
+      <w:numFmt w:val="bullet"/>
+      <w:lvlText w:val=""/>
+      <w:lvlJc w:val="left"/>
+      <w:pPr>
+        <w:tabs>
+          <w:tab w:val="num" w:pos="2160"/>
+        </w:tabs>
+        <w:ind w:left="2160" w:hanging="360"/>
+      </w:pPr>
+      <w:rPr>
+        <w:rFonts w:ascii="Wingdings" w:hAnsi="Wingdings" w:hint="default"/>
+        <w:sz w:val="20"/>
+      </w:rPr>
+    </w:lvl>
+    <w:lvl w:ilvl="3" w:tentative="1">
+      <w:start w:val="1"/>
+      <w:numFmt w:val="bullet"/>
+      <w:lvlText w:val=""/>
+      <w:lvlJc w:val="left"/>
+      <w:pPr>
+        <w:tabs>
+          <w:tab w:val="num" w:pos="2880"/>
+        </w:tabs>
+        <w:ind w:left="2880" w:hanging="360"/>
+      </w:pPr>
+      <w:rPr>
+        <w:rFonts w:ascii="Wingdings" w:hAnsi="Wingdings" w:hint="default"/>
+        <w:sz w:val="20"/>
+      </w:rPr>
+    </w:lvl>
+    <w:lvl w:ilvl="4" w:tentative="1">
+      <w:start w:val="1"/>
+      <w:numFmt w:val="bullet"/>
+      <w:lvlText w:val=""/>
+      <w:lvlJc w:val="left"/>
+      <w:pPr>
+        <w:tabs>
+          <w:tab w:val="num" w:pos="3600"/>
+        </w:tabs>
+        <w:ind w:left="3600" w:hanging="360"/>
+      </w:pPr>
+      <w:rPr>
+        <w:rFonts w:ascii="Wingdings" w:hAnsi="Wingdings" w:hint="default"/>
+        <w:sz w:val="20"/>
+      </w:rPr>
+    </w:lvl>
+    <w:lvl w:ilvl="5" w:tentative="1">
+      <w:start w:val="1"/>
+      <w:numFmt w:val="bullet"/>
+      <w:lvlText w:val=""/>
+      <w:lvlJc w:val="left"/>
+      <w:pPr>
+        <w:tabs>
+          <w:tab w:val="num" w:pos="4320"/>
+        </w:tabs>
+        <w:ind w:left="4320" w:hanging="360"/>
+      </w:pPr>
+      <w:rPr>
+        <w:rFonts w:ascii="Wingdings" w:hAnsi="Wingdings" w:hint="default"/>
+        <w:sz w:val="20"/>
+      </w:rPr>
+    </w:lvl>
+    <w:lvl w:ilvl="6" w:tentative="1">
+      <w:start w:val="1"/>
+      <w:numFmt w:val="bullet"/>
+      <w:lvlText w:val=""/>
+      <w:lvlJc w:val="left"/>
+      <w:pPr>
+        <w:tabs>
+          <w:tab w:val="num" w:pos="5040"/>
+        </w:tabs>
+        <w:ind w:left="5040" w:hanging="360"/>
+      </w:pPr>
+      <w:rPr>
+        <w:rFonts w:ascii="Wingdings" w:hAnsi="Wingdings" w:hint="default"/>
+        <w:sz w:val="20"/>
+      </w:rPr>
+    </w:lvl>
+    <w:lvl w:ilvl="7" w:tentative="1">
+      <w:start w:val="1"/>
+      <w:numFmt w:val="bullet"/>
+      <w:lvlText w:val=""/>
+      <w:lvlJc w:val="left"/>
+      <w:pPr>
+        <w:tabs>
+          <w:tab w:val="num" w:pos="5760"/>
+        </w:tabs>
+        <w:ind w:left="5760" w:hanging="360"/>
+      </w:pPr>
+      <w:rPr>
+        <w:rFonts w:ascii="Wingdings" w:hAnsi="Wingdings" w:hint="default"/>
+        <w:sz w:val="20"/>
+      </w:rPr>
+    </w:lvl>
+    <w:lvl w:ilvl="8" w:tentative="1">
+      <w:start w:val="1"/>
+      <w:numFmt w:val="bullet"/>
+      <w:lvlText w:val=""/>
+      <w:lvlJc w:val="left"/>
+      <w:pPr>
+        <w:tabs>
+          <w:tab w:val="num" w:pos="6480"/>
+        </w:tabs>
+        <w:ind w:left="6480" w:hanging="360"/>
+      </w:pPr>
+      <w:rPr>
+        <w:rFonts w:ascii="Wingdings" w:hAnsi="Wingdings" w:hint="default"/>
+        <w:sz w:val="20"/>
+      </w:rPr>
+    </w:lvl>
+  </w:abstractNum>
+  <w:abstractNum w:abstractNumId="18" w15:restartNumberingAfterBreak="0">
     <w:nsid w:val="47A304C8"/>
     <w:multiLevelType w:val="multilevel"/>
     <w:tmpl w:val="4D44C010"/>
@@ -10971,7 +11037,305 @@
       </w:pPr>
     </w:lvl>
   </w:abstractNum>
-  <w:abstractNum w:abstractNumId="14" w15:restartNumberingAfterBreak="0">
+  <w:abstractNum w:abstractNumId="19" w15:restartNumberingAfterBreak="0">
+    <w:nsid w:val="4BD55DF6"/>
+    <w:multiLevelType w:val="multilevel"/>
+    <w:tmpl w:val="E3609B40"/>
+    <w:lvl w:ilvl="0">
+      <w:start w:val="1"/>
+      <w:numFmt w:val="bullet"/>
+      <w:lvlText w:val=""/>
+      <w:lvlJc w:val="left"/>
+      <w:pPr>
+        <w:tabs>
+          <w:tab w:val="num" w:pos="720"/>
+        </w:tabs>
+        <w:ind w:left="720" w:hanging="360"/>
+      </w:pPr>
+      <w:rPr>
+        <w:rFonts w:ascii="Symbol" w:hAnsi="Symbol" w:hint="default"/>
+        <w:sz w:val="20"/>
+      </w:rPr>
+    </w:lvl>
+    <w:lvl w:ilvl="1" w:tentative="1">
+      <w:start w:val="1"/>
+      <w:numFmt w:val="bullet"/>
+      <w:lvlText w:val="o"/>
+      <w:lvlJc w:val="left"/>
+      <w:pPr>
+        <w:tabs>
+          <w:tab w:val="num" w:pos="1440"/>
+        </w:tabs>
+        <w:ind w:left="1440" w:hanging="360"/>
+      </w:pPr>
+      <w:rPr>
+        <w:rFonts w:ascii="Courier New" w:hAnsi="Courier New" w:hint="default"/>
+        <w:sz w:val="20"/>
+      </w:rPr>
+    </w:lvl>
+    <w:lvl w:ilvl="2" w:tentative="1">
+      <w:start w:val="1"/>
+      <w:numFmt w:val="bullet"/>
+      <w:lvlText w:val=""/>
+      <w:lvlJc w:val="left"/>
+      <w:pPr>
+        <w:tabs>
+          <w:tab w:val="num" w:pos="2160"/>
+        </w:tabs>
+        <w:ind w:left="2160" w:hanging="360"/>
+      </w:pPr>
+      <w:rPr>
+        <w:rFonts w:ascii="Wingdings" w:hAnsi="Wingdings" w:hint="default"/>
+        <w:sz w:val="20"/>
+      </w:rPr>
+    </w:lvl>
+    <w:lvl w:ilvl="3" w:tentative="1">
+      <w:start w:val="1"/>
+      <w:numFmt w:val="bullet"/>
+      <w:lvlText w:val=""/>
+      <w:lvlJc w:val="left"/>
+      <w:pPr>
+        <w:tabs>
+          <w:tab w:val="num" w:pos="2880"/>
+        </w:tabs>
+        <w:ind w:left="2880" w:hanging="360"/>
+      </w:pPr>
+      <w:rPr>
+        <w:rFonts w:ascii="Wingdings" w:hAnsi="Wingdings" w:hint="default"/>
+        <w:sz w:val="20"/>
+      </w:rPr>
+    </w:lvl>
+    <w:lvl w:ilvl="4" w:tentative="1">
+      <w:start w:val="1"/>
+      <w:numFmt w:val="bullet"/>
+      <w:lvlText w:val=""/>
+      <w:lvlJc w:val="left"/>
+      <w:pPr>
+        <w:tabs>
+          <w:tab w:val="num" w:pos="3600"/>
+        </w:tabs>
+        <w:ind w:left="3600" w:hanging="360"/>
+      </w:pPr>
+      <w:rPr>
+        <w:rFonts w:ascii="Wingdings" w:hAnsi="Wingdings" w:hint="default"/>
+        <w:sz w:val="20"/>
+      </w:rPr>
+    </w:lvl>
+    <w:lvl w:ilvl="5" w:tentative="1">
+      <w:start w:val="1"/>
+      <w:numFmt w:val="bullet"/>
+      <w:lvlText w:val=""/>
+      <w:lvlJc w:val="left"/>
+      <w:pPr>
+        <w:tabs>
+          <w:tab w:val="num" w:pos="4320"/>
+        </w:tabs>
+        <w:ind w:left="4320" w:hanging="360"/>
+      </w:pPr>
+      <w:rPr>
+        <w:rFonts w:ascii="Wingdings" w:hAnsi="Wingdings" w:hint="default"/>
+        <w:sz w:val="20"/>
+      </w:rPr>
+    </w:lvl>
+    <w:lvl w:ilvl="6" w:tentative="1">
+      <w:start w:val="1"/>
+      <w:numFmt w:val="bullet"/>
+      <w:lvlText w:val=""/>
+      <w:lvlJc w:val="left"/>
+      <w:pPr>
+        <w:tabs>
+          <w:tab w:val="num" w:pos="5040"/>
+        </w:tabs>
+        <w:ind w:left="5040" w:hanging="360"/>
+      </w:pPr>
+      <w:rPr>
+        <w:rFonts w:ascii="Wingdings" w:hAnsi="Wingdings" w:hint="default"/>
+        <w:sz w:val="20"/>
+      </w:rPr>
+    </w:lvl>
+    <w:lvl w:ilvl="7" w:tentative="1">
+      <w:start w:val="1"/>
+      <w:numFmt w:val="bullet"/>
+      <w:lvlText w:val=""/>
+      <w:lvlJc w:val="left"/>
+      <w:pPr>
+        <w:tabs>
+          <w:tab w:val="num" w:pos="5760"/>
+        </w:tabs>
+        <w:ind w:left="5760" w:hanging="360"/>
+      </w:pPr>
+      <w:rPr>
+        <w:rFonts w:ascii="Wingdings" w:hAnsi="Wingdings" w:hint="default"/>
+        <w:sz w:val="20"/>
+      </w:rPr>
+    </w:lvl>
+    <w:lvl w:ilvl="8" w:tentative="1">
+      <w:start w:val="1"/>
+      <w:numFmt w:val="bullet"/>
+      <w:lvlText w:val=""/>
+      <w:lvlJc w:val="left"/>
+      <w:pPr>
+        <w:tabs>
+          <w:tab w:val="num" w:pos="6480"/>
+        </w:tabs>
+        <w:ind w:left="6480" w:hanging="360"/>
+      </w:pPr>
+      <w:rPr>
+        <w:rFonts w:ascii="Wingdings" w:hAnsi="Wingdings" w:hint="default"/>
+        <w:sz w:val="20"/>
+      </w:rPr>
+    </w:lvl>
+  </w:abstractNum>
+  <w:abstractNum w:abstractNumId="20" w15:restartNumberingAfterBreak="0">
+    <w:nsid w:val="4FB21841"/>
+    <w:multiLevelType w:val="multilevel"/>
+    <w:tmpl w:val="595E0130"/>
+    <w:lvl w:ilvl="0">
+      <w:start w:val="1"/>
+      <w:numFmt w:val="bullet"/>
+      <w:lvlText w:val=""/>
+      <w:lvlJc w:val="left"/>
+      <w:pPr>
+        <w:tabs>
+          <w:tab w:val="num" w:pos="720"/>
+        </w:tabs>
+        <w:ind w:left="720" w:hanging="360"/>
+      </w:pPr>
+      <w:rPr>
+        <w:rFonts w:ascii="Symbol" w:hAnsi="Symbol" w:hint="default"/>
+        <w:sz w:val="20"/>
+      </w:rPr>
+    </w:lvl>
+    <w:lvl w:ilvl="1" w:tentative="1">
+      <w:start w:val="1"/>
+      <w:numFmt w:val="bullet"/>
+      <w:lvlText w:val="o"/>
+      <w:lvlJc w:val="left"/>
+      <w:pPr>
+        <w:tabs>
+          <w:tab w:val="num" w:pos="1440"/>
+        </w:tabs>
+        <w:ind w:left="1440" w:hanging="360"/>
+      </w:pPr>
+      <w:rPr>
+        <w:rFonts w:ascii="Courier New" w:hAnsi="Courier New" w:hint="default"/>
+        <w:sz w:val="20"/>
+      </w:rPr>
+    </w:lvl>
+    <w:lvl w:ilvl="2" w:tentative="1">
+      <w:start w:val="1"/>
+      <w:numFmt w:val="bullet"/>
+      <w:lvlText w:val=""/>
+      <w:lvlJc w:val="left"/>
+      <w:pPr>
+        <w:tabs>
+          <w:tab w:val="num" w:pos="2160"/>
+        </w:tabs>
+        <w:ind w:left="2160" w:hanging="360"/>
+      </w:pPr>
+      <w:rPr>
+        <w:rFonts w:ascii="Wingdings" w:hAnsi="Wingdings" w:hint="default"/>
+        <w:sz w:val="20"/>
+      </w:rPr>
+    </w:lvl>
+    <w:lvl w:ilvl="3" w:tentative="1">
+      <w:start w:val="1"/>
+      <w:numFmt w:val="bullet"/>
+      <w:lvlText w:val=""/>
+      <w:lvlJc w:val="left"/>
+      <w:pPr>
+        <w:tabs>
+          <w:tab w:val="num" w:pos="2880"/>
+        </w:tabs>
+        <w:ind w:left="2880" w:hanging="360"/>
+      </w:pPr>
+      <w:rPr>
+        <w:rFonts w:ascii="Wingdings" w:hAnsi="Wingdings" w:hint="default"/>
+        <w:sz w:val="20"/>
+      </w:rPr>
+    </w:lvl>
+    <w:lvl w:ilvl="4" w:tentative="1">
+      <w:start w:val="1"/>
+      <w:numFmt w:val="bullet"/>
+      <w:lvlText w:val=""/>
+      <w:lvlJc w:val="left"/>
+      <w:pPr>
+        <w:tabs>
+          <w:tab w:val="num" w:pos="3600"/>
+        </w:tabs>
+        <w:ind w:left="3600" w:hanging="360"/>
+      </w:pPr>
+      <w:rPr>
+        <w:rFonts w:ascii="Wingdings" w:hAnsi="Wingdings" w:hint="default"/>
+        <w:sz w:val="20"/>
+      </w:rPr>
+    </w:lvl>
+    <w:lvl w:ilvl="5" w:tentative="1">
+      <w:start w:val="1"/>
+      <w:numFmt w:val="bullet"/>
+      <w:lvlText w:val=""/>
+      <w:lvlJc w:val="left"/>
+      <w:pPr>
+        <w:tabs>
+          <w:tab w:val="num" w:pos="4320"/>
+        </w:tabs>
+        <w:ind w:left="4320" w:hanging="360"/>
+      </w:pPr>
+      <w:rPr>
+        <w:rFonts w:ascii="Wingdings" w:hAnsi="Wingdings" w:hint="default"/>
+        <w:sz w:val="20"/>
+      </w:rPr>
+    </w:lvl>
+    <w:lvl w:ilvl="6" w:tentative="1">
+      <w:start w:val="1"/>
+      <w:numFmt w:val="bullet"/>
+      <w:lvlText w:val=""/>
+      <w:lvlJc w:val="left"/>
+      <w:pPr>
+        <w:tabs>
+          <w:tab w:val="num" w:pos="5040"/>
+        </w:tabs>
+        <w:ind w:left="5040" w:hanging="360"/>
+      </w:pPr>
+      <w:rPr>
+        <w:rFonts w:ascii="Wingdings" w:hAnsi="Wingdings" w:hint="default"/>
+        <w:sz w:val="20"/>
+      </w:rPr>
+    </w:lvl>
+    <w:lvl w:ilvl="7" w:tentative="1">
+      <w:start w:val="1"/>
+      <w:numFmt w:val="bullet"/>
+      <w:lvlText w:val=""/>
+      <w:lvlJc w:val="left"/>
+      <w:pPr>
+        <w:tabs>
+          <w:tab w:val="num" w:pos="5760"/>
+        </w:tabs>
+        <w:ind w:left="5760" w:hanging="360"/>
+      </w:pPr>
+      <w:rPr>
+        <w:rFonts w:ascii="Wingdings" w:hAnsi="Wingdings" w:hint="default"/>
+        <w:sz w:val="20"/>
+      </w:rPr>
+    </w:lvl>
+    <w:lvl w:ilvl="8" w:tentative="1">
+      <w:start w:val="1"/>
+      <w:numFmt w:val="bullet"/>
+      <w:lvlText w:val=""/>
+      <w:lvlJc w:val="left"/>
+      <w:pPr>
+        <w:tabs>
+          <w:tab w:val="num" w:pos="6480"/>
+        </w:tabs>
+        <w:ind w:left="6480" w:hanging="360"/>
+      </w:pPr>
+      <w:rPr>
+        <w:rFonts w:ascii="Wingdings" w:hAnsi="Wingdings" w:hint="default"/>
+        <w:sz w:val="20"/>
+      </w:rPr>
+    </w:lvl>
+  </w:abstractNum>
+  <w:abstractNum w:abstractNumId="21" w15:restartNumberingAfterBreak="0">
     <w:nsid w:val="532D1C57"/>
     <w:multiLevelType w:val="multilevel"/>
     <w:tmpl w:val="DE26E05A"/>
@@ -11084,7 +11448,7 @@
       </w:pPr>
     </w:lvl>
   </w:abstractNum>
-  <w:abstractNum w:abstractNumId="15" w15:restartNumberingAfterBreak="0">
+  <w:abstractNum w:abstractNumId="22" w15:restartNumberingAfterBreak="0">
     <w:nsid w:val="58D51F0D"/>
     <w:multiLevelType w:val="multilevel"/>
     <w:tmpl w:val="E9CE32CC"/>
@@ -11197,7 +11561,7 @@
       </w:pPr>
     </w:lvl>
   </w:abstractNum>
-  <w:abstractNum w:abstractNumId="16" w15:restartNumberingAfterBreak="0">
+  <w:abstractNum w:abstractNumId="23" w15:restartNumberingAfterBreak="0">
     <w:nsid w:val="5A9B4718"/>
     <w:multiLevelType w:val="multilevel"/>
     <w:tmpl w:val="57CC9C32"/>
@@ -11310,7 +11674,7 @@
       </w:pPr>
     </w:lvl>
   </w:abstractNum>
-  <w:abstractNum w:abstractNumId="17" w15:restartNumberingAfterBreak="0">
+  <w:abstractNum w:abstractNumId="24" w15:restartNumberingAfterBreak="0">
     <w:nsid w:val="5EC202BF"/>
     <w:multiLevelType w:val="multilevel"/>
     <w:tmpl w:val="F038599C"/>
@@ -11459,7 +11823,7 @@
       </w:rPr>
     </w:lvl>
   </w:abstractNum>
-  <w:abstractNum w:abstractNumId="18" w15:restartNumberingAfterBreak="0">
+  <w:abstractNum w:abstractNumId="25" w15:restartNumberingAfterBreak="0">
     <w:nsid w:val="5FA575EA"/>
     <w:multiLevelType w:val="multilevel"/>
     <w:tmpl w:val="C52E250A"/>
@@ -11572,7 +11936,305 @@
       </w:pPr>
     </w:lvl>
   </w:abstractNum>
-  <w:abstractNum w:abstractNumId="19" w15:restartNumberingAfterBreak="0">
+  <w:abstractNum w:abstractNumId="26" w15:restartNumberingAfterBreak="0">
+    <w:nsid w:val="63A86F53"/>
+    <w:multiLevelType w:val="multilevel"/>
+    <w:tmpl w:val="3AFAF66A"/>
+    <w:lvl w:ilvl="0">
+      <w:start w:val="1"/>
+      <w:numFmt w:val="bullet"/>
+      <w:lvlText w:val=""/>
+      <w:lvlJc w:val="left"/>
+      <w:pPr>
+        <w:tabs>
+          <w:tab w:val="num" w:pos="720"/>
+        </w:tabs>
+        <w:ind w:left="720" w:hanging="360"/>
+      </w:pPr>
+      <w:rPr>
+        <w:rFonts w:ascii="Symbol" w:hAnsi="Symbol" w:hint="default"/>
+        <w:sz w:val="20"/>
+      </w:rPr>
+    </w:lvl>
+    <w:lvl w:ilvl="1" w:tentative="1">
+      <w:start w:val="1"/>
+      <w:numFmt w:val="bullet"/>
+      <w:lvlText w:val="o"/>
+      <w:lvlJc w:val="left"/>
+      <w:pPr>
+        <w:tabs>
+          <w:tab w:val="num" w:pos="1440"/>
+        </w:tabs>
+        <w:ind w:left="1440" w:hanging="360"/>
+      </w:pPr>
+      <w:rPr>
+        <w:rFonts w:ascii="Courier New" w:hAnsi="Courier New" w:hint="default"/>
+        <w:sz w:val="20"/>
+      </w:rPr>
+    </w:lvl>
+    <w:lvl w:ilvl="2" w:tentative="1">
+      <w:start w:val="1"/>
+      <w:numFmt w:val="bullet"/>
+      <w:lvlText w:val=""/>
+      <w:lvlJc w:val="left"/>
+      <w:pPr>
+        <w:tabs>
+          <w:tab w:val="num" w:pos="2160"/>
+        </w:tabs>
+        <w:ind w:left="2160" w:hanging="360"/>
+      </w:pPr>
+      <w:rPr>
+        <w:rFonts w:ascii="Wingdings" w:hAnsi="Wingdings" w:hint="default"/>
+        <w:sz w:val="20"/>
+      </w:rPr>
+    </w:lvl>
+    <w:lvl w:ilvl="3" w:tentative="1">
+      <w:start w:val="1"/>
+      <w:numFmt w:val="bullet"/>
+      <w:lvlText w:val=""/>
+      <w:lvlJc w:val="left"/>
+      <w:pPr>
+        <w:tabs>
+          <w:tab w:val="num" w:pos="2880"/>
+        </w:tabs>
+        <w:ind w:left="2880" w:hanging="360"/>
+      </w:pPr>
+      <w:rPr>
+        <w:rFonts w:ascii="Wingdings" w:hAnsi="Wingdings" w:hint="default"/>
+        <w:sz w:val="20"/>
+      </w:rPr>
+    </w:lvl>
+    <w:lvl w:ilvl="4" w:tentative="1">
+      <w:start w:val="1"/>
+      <w:numFmt w:val="bullet"/>
+      <w:lvlText w:val=""/>
+      <w:lvlJc w:val="left"/>
+      <w:pPr>
+        <w:tabs>
+          <w:tab w:val="num" w:pos="3600"/>
+        </w:tabs>
+        <w:ind w:left="3600" w:hanging="360"/>
+      </w:pPr>
+      <w:rPr>
+        <w:rFonts w:ascii="Wingdings" w:hAnsi="Wingdings" w:hint="default"/>
+        <w:sz w:val="20"/>
+      </w:rPr>
+    </w:lvl>
+    <w:lvl w:ilvl="5" w:tentative="1">
+      <w:start w:val="1"/>
+      <w:numFmt w:val="bullet"/>
+      <w:lvlText w:val=""/>
+      <w:lvlJc w:val="left"/>
+      <w:pPr>
+        <w:tabs>
+          <w:tab w:val="num" w:pos="4320"/>
+        </w:tabs>
+        <w:ind w:left="4320" w:hanging="360"/>
+      </w:pPr>
+      <w:rPr>
+        <w:rFonts w:ascii="Wingdings" w:hAnsi="Wingdings" w:hint="default"/>
+        <w:sz w:val="20"/>
+      </w:rPr>
+    </w:lvl>
+    <w:lvl w:ilvl="6" w:tentative="1">
+      <w:start w:val="1"/>
+      <w:numFmt w:val="bullet"/>
+      <w:lvlText w:val=""/>
+      <w:lvlJc w:val="left"/>
+      <w:pPr>
+        <w:tabs>
+          <w:tab w:val="num" w:pos="5040"/>
+        </w:tabs>
+        <w:ind w:left="5040" w:hanging="360"/>
+      </w:pPr>
+      <w:rPr>
+        <w:rFonts w:ascii="Wingdings" w:hAnsi="Wingdings" w:hint="default"/>
+        <w:sz w:val="20"/>
+      </w:rPr>
+    </w:lvl>
+    <w:lvl w:ilvl="7" w:tentative="1">
+      <w:start w:val="1"/>
+      <w:numFmt w:val="bullet"/>
+      <w:lvlText w:val=""/>
+      <w:lvlJc w:val="left"/>
+      <w:pPr>
+        <w:tabs>
+          <w:tab w:val="num" w:pos="5760"/>
+        </w:tabs>
+        <w:ind w:left="5760" w:hanging="360"/>
+      </w:pPr>
+      <w:rPr>
+        <w:rFonts w:ascii="Wingdings" w:hAnsi="Wingdings" w:hint="default"/>
+        <w:sz w:val="20"/>
+      </w:rPr>
+    </w:lvl>
+    <w:lvl w:ilvl="8" w:tentative="1">
+      <w:start w:val="1"/>
+      <w:numFmt w:val="bullet"/>
+      <w:lvlText w:val=""/>
+      <w:lvlJc w:val="left"/>
+      <w:pPr>
+        <w:tabs>
+          <w:tab w:val="num" w:pos="6480"/>
+        </w:tabs>
+        <w:ind w:left="6480" w:hanging="360"/>
+      </w:pPr>
+      <w:rPr>
+        <w:rFonts w:ascii="Wingdings" w:hAnsi="Wingdings" w:hint="default"/>
+        <w:sz w:val="20"/>
+      </w:rPr>
+    </w:lvl>
+  </w:abstractNum>
+  <w:abstractNum w:abstractNumId="27" w15:restartNumberingAfterBreak="0">
+    <w:nsid w:val="649506D0"/>
+    <w:multiLevelType w:val="multilevel"/>
+    <w:tmpl w:val="1CC4F6A8"/>
+    <w:lvl w:ilvl="0">
+      <w:start w:val="1"/>
+      <w:numFmt w:val="bullet"/>
+      <w:lvlText w:val=""/>
+      <w:lvlJc w:val="left"/>
+      <w:pPr>
+        <w:tabs>
+          <w:tab w:val="num" w:pos="720"/>
+        </w:tabs>
+        <w:ind w:left="720" w:hanging="360"/>
+      </w:pPr>
+      <w:rPr>
+        <w:rFonts w:ascii="Symbol" w:hAnsi="Symbol" w:hint="default"/>
+        <w:sz w:val="20"/>
+      </w:rPr>
+    </w:lvl>
+    <w:lvl w:ilvl="1" w:tentative="1">
+      <w:start w:val="1"/>
+      <w:numFmt w:val="bullet"/>
+      <w:lvlText w:val="o"/>
+      <w:lvlJc w:val="left"/>
+      <w:pPr>
+        <w:tabs>
+          <w:tab w:val="num" w:pos="1440"/>
+        </w:tabs>
+        <w:ind w:left="1440" w:hanging="360"/>
+      </w:pPr>
+      <w:rPr>
+        <w:rFonts w:ascii="Courier New" w:hAnsi="Courier New" w:hint="default"/>
+        <w:sz w:val="20"/>
+      </w:rPr>
+    </w:lvl>
+    <w:lvl w:ilvl="2" w:tentative="1">
+      <w:start w:val="1"/>
+      <w:numFmt w:val="bullet"/>
+      <w:lvlText w:val=""/>
+      <w:lvlJc w:val="left"/>
+      <w:pPr>
+        <w:tabs>
+          <w:tab w:val="num" w:pos="2160"/>
+        </w:tabs>
+        <w:ind w:left="2160" w:hanging="360"/>
+      </w:pPr>
+      <w:rPr>
+        <w:rFonts w:ascii="Wingdings" w:hAnsi="Wingdings" w:hint="default"/>
+        <w:sz w:val="20"/>
+      </w:rPr>
+    </w:lvl>
+    <w:lvl w:ilvl="3" w:tentative="1">
+      <w:start w:val="1"/>
+      <w:numFmt w:val="bullet"/>
+      <w:lvlText w:val=""/>
+      <w:lvlJc w:val="left"/>
+      <w:pPr>
+        <w:tabs>
+          <w:tab w:val="num" w:pos="2880"/>
+        </w:tabs>
+        <w:ind w:left="2880" w:hanging="360"/>
+      </w:pPr>
+      <w:rPr>
+        <w:rFonts w:ascii="Wingdings" w:hAnsi="Wingdings" w:hint="default"/>
+        <w:sz w:val="20"/>
+      </w:rPr>
+    </w:lvl>
+    <w:lvl w:ilvl="4" w:tentative="1">
+      <w:start w:val="1"/>
+      <w:numFmt w:val="bullet"/>
+      <w:lvlText w:val=""/>
+      <w:lvlJc w:val="left"/>
+      <w:pPr>
+        <w:tabs>
+          <w:tab w:val="num" w:pos="3600"/>
+        </w:tabs>
+        <w:ind w:left="3600" w:hanging="360"/>
+      </w:pPr>
+      <w:rPr>
+        <w:rFonts w:ascii="Wingdings" w:hAnsi="Wingdings" w:hint="default"/>
+        <w:sz w:val="20"/>
+      </w:rPr>
+    </w:lvl>
+    <w:lvl w:ilvl="5" w:tentative="1">
+      <w:start w:val="1"/>
+      <w:numFmt w:val="bullet"/>
+      <w:lvlText w:val=""/>
+      <w:lvlJc w:val="left"/>
+      <w:pPr>
+        <w:tabs>
+          <w:tab w:val="num" w:pos="4320"/>
+        </w:tabs>
+        <w:ind w:left="4320" w:hanging="360"/>
+      </w:pPr>
+      <w:rPr>
+        <w:rFonts w:ascii="Wingdings" w:hAnsi="Wingdings" w:hint="default"/>
+        <w:sz w:val="20"/>
+      </w:rPr>
+    </w:lvl>
+    <w:lvl w:ilvl="6" w:tentative="1">
+      <w:start w:val="1"/>
+      <w:numFmt w:val="bullet"/>
+      <w:lvlText w:val=""/>
+      <w:lvlJc w:val="left"/>
+      <w:pPr>
+        <w:tabs>
+          <w:tab w:val="num" w:pos="5040"/>
+        </w:tabs>
+        <w:ind w:left="5040" w:hanging="360"/>
+      </w:pPr>
+      <w:rPr>
+        <w:rFonts w:ascii="Wingdings" w:hAnsi="Wingdings" w:hint="default"/>
+        <w:sz w:val="20"/>
+      </w:rPr>
+    </w:lvl>
+    <w:lvl w:ilvl="7" w:tentative="1">
+      <w:start w:val="1"/>
+      <w:numFmt w:val="bullet"/>
+      <w:lvlText w:val=""/>
+      <w:lvlJc w:val="left"/>
+      <w:pPr>
+        <w:tabs>
+          <w:tab w:val="num" w:pos="5760"/>
+        </w:tabs>
+        <w:ind w:left="5760" w:hanging="360"/>
+      </w:pPr>
+      <w:rPr>
+        <w:rFonts w:ascii="Wingdings" w:hAnsi="Wingdings" w:hint="default"/>
+        <w:sz w:val="20"/>
+      </w:rPr>
+    </w:lvl>
+    <w:lvl w:ilvl="8" w:tentative="1">
+      <w:start w:val="1"/>
+      <w:numFmt w:val="bullet"/>
+      <w:lvlText w:val=""/>
+      <w:lvlJc w:val="left"/>
+      <w:pPr>
+        <w:tabs>
+          <w:tab w:val="num" w:pos="6480"/>
+        </w:tabs>
+        <w:ind w:left="6480" w:hanging="360"/>
+      </w:pPr>
+      <w:rPr>
+        <w:rFonts w:ascii="Wingdings" w:hAnsi="Wingdings" w:hint="default"/>
+        <w:sz w:val="20"/>
+      </w:rPr>
+    </w:lvl>
+  </w:abstractNum>
+  <w:abstractNum w:abstractNumId="28" w15:restartNumberingAfterBreak="0">
     <w:nsid w:val="6ACB4DB0"/>
     <w:multiLevelType w:val="multilevel"/>
     <w:tmpl w:val="5994FE3A"/>
@@ -11689,7 +12351,7 @@
       </w:pPr>
     </w:lvl>
   </w:abstractNum>
-  <w:abstractNum w:abstractNumId="20" w15:restartNumberingAfterBreak="0">
+  <w:abstractNum w:abstractNumId="29" w15:restartNumberingAfterBreak="0">
     <w:nsid w:val="6BD17F11"/>
     <w:multiLevelType w:val="multilevel"/>
     <w:tmpl w:val="21E0FF1A"/>
@@ -11838,7 +12500,156 @@
       </w:rPr>
     </w:lvl>
   </w:abstractNum>
-  <w:abstractNum w:abstractNumId="21" w15:restartNumberingAfterBreak="0">
+  <w:abstractNum w:abstractNumId="30" w15:restartNumberingAfterBreak="0">
+    <w:nsid w:val="6F8E7D6E"/>
+    <w:multiLevelType w:val="multilevel"/>
+    <w:tmpl w:val="5268F150"/>
+    <w:lvl w:ilvl="0">
+      <w:start w:val="1"/>
+      <w:numFmt w:val="bullet"/>
+      <w:lvlText w:val=""/>
+      <w:lvlJc w:val="left"/>
+      <w:pPr>
+        <w:tabs>
+          <w:tab w:val="num" w:pos="720"/>
+        </w:tabs>
+        <w:ind w:left="720" w:hanging="360"/>
+      </w:pPr>
+      <w:rPr>
+        <w:rFonts w:ascii="Symbol" w:hAnsi="Symbol" w:hint="default"/>
+        <w:sz w:val="20"/>
+      </w:rPr>
+    </w:lvl>
+    <w:lvl w:ilvl="1" w:tentative="1">
+      <w:start w:val="1"/>
+      <w:numFmt w:val="bullet"/>
+      <w:lvlText w:val="o"/>
+      <w:lvlJc w:val="left"/>
+      <w:pPr>
+        <w:tabs>
+          <w:tab w:val="num" w:pos="1440"/>
+        </w:tabs>
+        <w:ind w:left="1440" w:hanging="360"/>
+      </w:pPr>
+      <w:rPr>
+        <w:rFonts w:ascii="Courier New" w:hAnsi="Courier New" w:hint="default"/>
+        <w:sz w:val="20"/>
+      </w:rPr>
+    </w:lvl>
+    <w:lvl w:ilvl="2" w:tentative="1">
+      <w:start w:val="1"/>
+      <w:numFmt w:val="bullet"/>
+      <w:lvlText w:val=""/>
+      <w:lvlJc w:val="left"/>
+      <w:pPr>
+        <w:tabs>
+          <w:tab w:val="num" w:pos="2160"/>
+        </w:tabs>
+        <w:ind w:left="2160" w:hanging="360"/>
+      </w:pPr>
+      <w:rPr>
+        <w:rFonts w:ascii="Wingdings" w:hAnsi="Wingdings" w:hint="default"/>
+        <w:sz w:val="20"/>
+      </w:rPr>
+    </w:lvl>
+    <w:lvl w:ilvl="3" w:tentative="1">
+      <w:start w:val="1"/>
+      <w:numFmt w:val="bullet"/>
+      <w:lvlText w:val=""/>
+      <w:lvlJc w:val="left"/>
+      <w:pPr>
+        <w:tabs>
+          <w:tab w:val="num" w:pos="2880"/>
+        </w:tabs>
+        <w:ind w:left="2880" w:hanging="360"/>
+      </w:pPr>
+      <w:rPr>
+        <w:rFonts w:ascii="Wingdings" w:hAnsi="Wingdings" w:hint="default"/>
+        <w:sz w:val="20"/>
+      </w:rPr>
+    </w:lvl>
+    <w:lvl w:ilvl="4" w:tentative="1">
+      <w:start w:val="1"/>
+      <w:numFmt w:val="bullet"/>
+      <w:lvlText w:val=""/>
+      <w:lvlJc w:val="left"/>
+      <w:pPr>
+        <w:tabs>
+          <w:tab w:val="num" w:pos="3600"/>
+        </w:tabs>
+        <w:ind w:left="3600" w:hanging="360"/>
+      </w:pPr>
+      <w:rPr>
+        <w:rFonts w:ascii="Wingdings" w:hAnsi="Wingdings" w:hint="default"/>
+        <w:sz w:val="20"/>
+      </w:rPr>
+    </w:lvl>
+    <w:lvl w:ilvl="5" w:tentative="1">
+      <w:start w:val="1"/>
+      <w:numFmt w:val="bullet"/>
+      <w:lvlText w:val=""/>
+      <w:lvlJc w:val="left"/>
+      <w:pPr>
+        <w:tabs>
+          <w:tab w:val="num" w:pos="4320"/>
+        </w:tabs>
+        <w:ind w:left="4320" w:hanging="360"/>
+      </w:pPr>
+      <w:rPr>
+        <w:rFonts w:ascii="Wingdings" w:hAnsi="Wingdings" w:hint="default"/>
+        <w:sz w:val="20"/>
+      </w:rPr>
+    </w:lvl>
+    <w:lvl w:ilvl="6" w:tentative="1">
+      <w:start w:val="1"/>
+      <w:numFmt w:val="bullet"/>
+      <w:lvlText w:val=""/>
+      <w:lvlJc w:val="left"/>
+      <w:pPr>
+        <w:tabs>
+          <w:tab w:val="num" w:pos="5040"/>
+        </w:tabs>
+        <w:ind w:left="5040" w:hanging="360"/>
+      </w:pPr>
+      <w:rPr>
+        <w:rFonts w:ascii="Wingdings" w:hAnsi="Wingdings" w:hint="default"/>
+        <w:sz w:val="20"/>
+      </w:rPr>
+    </w:lvl>
+    <w:lvl w:ilvl="7" w:tentative="1">
+      <w:start w:val="1"/>
+      <w:numFmt w:val="bullet"/>
+      <w:lvlText w:val=""/>
+      <w:lvlJc w:val="left"/>
+      <w:pPr>
+        <w:tabs>
+          <w:tab w:val="num" w:pos="5760"/>
+        </w:tabs>
+        <w:ind w:left="5760" w:hanging="360"/>
+      </w:pPr>
+      <w:rPr>
+        <w:rFonts w:ascii="Wingdings" w:hAnsi="Wingdings" w:hint="default"/>
+        <w:sz w:val="20"/>
+      </w:rPr>
+    </w:lvl>
+    <w:lvl w:ilvl="8" w:tentative="1">
+      <w:start w:val="1"/>
+      <w:numFmt w:val="bullet"/>
+      <w:lvlText w:val=""/>
+      <w:lvlJc w:val="left"/>
+      <w:pPr>
+        <w:tabs>
+          <w:tab w:val="num" w:pos="6480"/>
+        </w:tabs>
+        <w:ind w:left="6480" w:hanging="360"/>
+      </w:pPr>
+      <w:rPr>
+        <w:rFonts w:ascii="Wingdings" w:hAnsi="Wingdings" w:hint="default"/>
+        <w:sz w:val="20"/>
+      </w:rPr>
+    </w:lvl>
+  </w:abstractNum>
+  <w:abstractNum w:abstractNumId="31" w15:restartNumberingAfterBreak="0">
     <w:nsid w:val="76C94A8F"/>
     <w:multiLevelType w:val="multilevel"/>
     <w:tmpl w:val="12021838"/>
@@ -11987,7 +12798,7 @@
       </w:rPr>
     </w:lvl>
   </w:abstractNum>
-  <w:abstractNum w:abstractNumId="22" w15:restartNumberingAfterBreak="0">
+  <w:abstractNum w:abstractNumId="32" w15:restartNumberingAfterBreak="0">
     <w:nsid w:val="78535618"/>
     <w:multiLevelType w:val="multilevel"/>
     <w:tmpl w:val="2F8EE7D6"/>
@@ -12136,7 +12947,7 @@
       </w:rPr>
     </w:lvl>
   </w:abstractNum>
-  <w:abstractNum w:abstractNumId="23" w15:restartNumberingAfterBreak="0">
+  <w:abstractNum w:abstractNumId="33" w15:restartNumberingAfterBreak="0">
     <w:nsid w:val="7A2E1219"/>
     <w:multiLevelType w:val="multilevel"/>
     <w:tmpl w:val="0A3E2B2C"/>
@@ -12249,7 +13060,7 @@
       </w:pPr>
     </w:lvl>
   </w:abstractNum>
-  <w:abstractNum w:abstractNumId="24" w15:restartNumberingAfterBreak="0">
+  <w:abstractNum w:abstractNumId="34" w15:restartNumberingAfterBreak="0">
     <w:nsid w:val="7C5C2487"/>
     <w:multiLevelType w:val="multilevel"/>
     <w:tmpl w:val="31641E56"/>
@@ -12362,7 +13173,7 @@
       </w:pPr>
     </w:lvl>
   </w:abstractNum>
-  <w:abstractNum w:abstractNumId="25" w15:restartNumberingAfterBreak="0">
+  <w:abstractNum w:abstractNumId="35" w15:restartNumberingAfterBreak="0">
     <w:nsid w:val="7F0B21E0"/>
     <w:multiLevelType w:val="multilevel"/>
     <w:tmpl w:val="7A26A73C"/>
@@ -12476,82 +13287,112 @@
     </w:lvl>
   </w:abstractNum>
   <w:num w:numId="1" w16cid:durableId="1239825105">
-    <w:abstractNumId w:val="4"/>
+    <w:abstractNumId w:val="6"/>
   </w:num>
   <w:num w:numId="2" w16cid:durableId="660154641">
-    <w:abstractNumId w:val="6"/>
+    <w:abstractNumId w:val="8"/>
   </w:num>
   <w:num w:numId="3" w16cid:durableId="974529981">
-    <w:abstractNumId w:val="5"/>
+    <w:abstractNumId w:val="7"/>
   </w:num>
   <w:num w:numId="4" w16cid:durableId="1004674494">
-    <w:abstractNumId w:val="21"/>
+    <w:abstractNumId w:val="31"/>
   </w:num>
   <w:num w:numId="5" w16cid:durableId="643199491">
+    <w:abstractNumId w:val="11"/>
+  </w:num>
+  <w:num w:numId="6" w16cid:durableId="1900246162">
     <w:abstractNumId w:val="9"/>
   </w:num>
-  <w:num w:numId="6" w16cid:durableId="1900246162">
-    <w:abstractNumId w:val="7"/>
-  </w:num>
   <w:num w:numId="7" w16cid:durableId="365564134">
-    <w:abstractNumId w:val="17"/>
+    <w:abstractNumId w:val="24"/>
   </w:num>
   <w:num w:numId="8" w16cid:durableId="2025470965">
     <w:abstractNumId w:val="2"/>
   </w:num>
   <w:num w:numId="9" w16cid:durableId="626738630">
-    <w:abstractNumId w:val="20"/>
+    <w:abstractNumId w:val="29"/>
   </w:num>
   <w:num w:numId="10" w16cid:durableId="1041783406">
     <w:abstractNumId w:val="0"/>
   </w:num>
   <w:num w:numId="11" w16cid:durableId="1250626461">
-    <w:abstractNumId w:val="19"/>
+    <w:abstractNumId w:val="28"/>
   </w:num>
   <w:num w:numId="12" w16cid:durableId="1027751062">
     <w:abstractNumId w:val="1"/>
   </w:num>
   <w:num w:numId="13" w16cid:durableId="843473664">
+    <w:abstractNumId w:val="5"/>
+  </w:num>
+  <w:num w:numId="14" w16cid:durableId="1490172215">
+    <w:abstractNumId w:val="18"/>
+  </w:num>
+  <w:num w:numId="15" w16cid:durableId="1431655833">
+    <w:abstractNumId w:val="16"/>
+  </w:num>
+  <w:num w:numId="16" w16cid:durableId="1620382236">
+    <w:abstractNumId w:val="10"/>
+  </w:num>
+  <w:num w:numId="17" w16cid:durableId="950162299">
+    <w:abstractNumId w:val="25"/>
+  </w:num>
+  <w:num w:numId="18" w16cid:durableId="1471636139">
+    <w:abstractNumId w:val="23"/>
+  </w:num>
+  <w:num w:numId="19" w16cid:durableId="782192063">
+    <w:abstractNumId w:val="35"/>
+  </w:num>
+  <w:num w:numId="20" w16cid:durableId="311252834">
+    <w:abstractNumId w:val="22"/>
+  </w:num>
+  <w:num w:numId="21" w16cid:durableId="505097405">
+    <w:abstractNumId w:val="34"/>
+  </w:num>
+  <w:num w:numId="22" w16cid:durableId="1057126809">
+    <w:abstractNumId w:val="13"/>
+  </w:num>
+  <w:num w:numId="23" w16cid:durableId="950474355">
+    <w:abstractNumId w:val="12"/>
+  </w:num>
+  <w:num w:numId="24" w16cid:durableId="1166095301">
+    <w:abstractNumId w:val="33"/>
+  </w:num>
+  <w:num w:numId="25" w16cid:durableId="1532062716">
+    <w:abstractNumId w:val="32"/>
+  </w:num>
+  <w:num w:numId="26" w16cid:durableId="1079600304">
+    <w:abstractNumId w:val="21"/>
+  </w:num>
+  <w:num w:numId="27" w16cid:durableId="885945617">
+    <w:abstractNumId w:val="15"/>
+  </w:num>
+  <w:num w:numId="28" w16cid:durableId="1728530516">
+    <w:abstractNumId w:val="26"/>
+  </w:num>
+  <w:num w:numId="29" w16cid:durableId="1530949463">
     <w:abstractNumId w:val="3"/>
   </w:num>
-  <w:num w:numId="14" w16cid:durableId="1490172215">
-    <w:abstractNumId w:val="13"/>
+  <w:num w:numId="30" w16cid:durableId="949357246">
+    <w:abstractNumId w:val="19"/>
   </w:num>
-  <w:num w:numId="15" w16cid:durableId="1431655833">
-    <w:abstractNumId w:val="12"/>
+  <w:num w:numId="31" w16cid:durableId="74132043">
+    <w:abstractNumId w:val="20"/>
   </w:num>
-  <w:num w:numId="16" w16cid:durableId="1620382236">
-    <w:abstractNumId w:val="8"/>
+  <w:num w:numId="32" w16cid:durableId="281428341">
+    <w:abstractNumId w:val="14"/>
   </w:num>
-  <w:num w:numId="17" w16cid:durableId="950162299">
-    <w:abstractNumId w:val="18"/>
+  <w:num w:numId="33" w16cid:durableId="290939837">
+    <w:abstractNumId w:val="27"/>
   </w:num>
-  <w:num w:numId="18" w16cid:durableId="1471636139">
-    <w:abstractNumId w:val="16"/>
+  <w:num w:numId="34" w16cid:durableId="1792239687">
+    <w:abstractNumId w:val="4"/>
   </w:num>
-  <w:num w:numId="19" w16cid:durableId="782192063">
-    <w:abstractNumId w:val="25"/>
+  <w:num w:numId="35" w16cid:durableId="1464498238">
+    <w:abstractNumId w:val="17"/>
   </w:num>
-  <w:num w:numId="20" w16cid:durableId="311252834">
-    <w:abstractNumId w:val="15"/>
-  </w:num>
-  <w:num w:numId="21" w16cid:durableId="505097405">
-    <w:abstractNumId w:val="24"/>
-  </w:num>
-  <w:num w:numId="22" w16cid:durableId="1057126809">
-    <w:abstractNumId w:val="11"/>
-  </w:num>
-  <w:num w:numId="23" w16cid:durableId="950474355">
-    <w:abstractNumId w:val="10"/>
-  </w:num>
-  <w:num w:numId="24" w16cid:durableId="1166095301">
-    <w:abstractNumId w:val="23"/>
-  </w:num>
-  <w:num w:numId="25" w16cid:durableId="1532062716">
-    <w:abstractNumId w:val="22"/>
-  </w:num>
-  <w:num w:numId="26" w16cid:durableId="1079600304">
-    <w:abstractNumId w:val="14"/>
+  <w:num w:numId="36" w16cid:durableId="710224679">
+    <w:abstractNumId w:val="30"/>
   </w:num>
 </w:numbering>
 </file>

</xml_diff>